<commit_message>
feat: Cap nhat he thong KHBD theo tuan, dong bo script check cuoc thi va chuan hoa tai lieu UNIGO
</commit_message>
<xml_diff>
--- a/Hệ thống mẫu văn bản/Nguyên đã làm/Kế hoạch dạy học Tin học từng lớp/Kế hoạch dạy học môn Tin học - Lớp 1 - 2026 - 2027.docx
+++ b/Hệ thống mẫu văn bản/Nguyên đã làm/Kế hoạch dạy học Tin học từng lớp/Kế hoạch dạy học môn Tin học - Lớp 1 - 2026 - 2027.docx
@@ -1380,21 +1380,29 @@
         </w:tblBorders>
       </w:tblPr>
       <w:tblGrid>
-        <w:gridCol w:w="1862"/>
-        <w:gridCol w:w="1862"/>
-        <w:gridCol w:w="1862"/>
-        <w:gridCol w:w="1862"/>
-        <w:gridCol w:w="1862"/>
+        <w:gridCol w:w="2327"/>
+        <w:gridCol w:w="2327"/>
+        <w:gridCol w:w="2327"/>
+        <w:gridCol w:w="2327"/>
       </w:tblGrid>
       <w:tr>
-        <w:tc>
-          <w:tcPr>
-            <w:tcW w:type="dxa" w:w="510"/>
-            <w:tcW w:w="510" w:type="dxa"/>
-            <w:tcW w:w="510" w:type="dxa"/>
-          </w:tcPr>
-          <w:p>
-            <w:pPr>
+        <w:trPr>
+          <w:tblHeader/>
+          <w:cantSplit/>
+        </w:trPr>
+        <w:tc>
+          <w:tcPr>
+            <w:tcW w:type="dxa" w:w="624"/>
+            <w:tcMar>
+              <w:top w:w="120" w:type="dxa"/>
+              <w:bottom w:w="120" w:type="dxa"/>
+              <w:left w:w="100" w:type="dxa"/>
+              <w:right w:w="100" w:type="dxa"/>
+            </w:tcMar>
+          </w:tcPr>
+          <w:p>
+            <w:pPr>
+              <w:spacing w:before="40" w:after="40" w:line="276" w:lineRule="auto"/>
               <w:jc w:val="center"/>
             </w:pPr>
             <w:r>
@@ -1409,12 +1417,17 @@
         </w:tc>
         <w:tc>
           <w:tcPr>
-            <w:tcW w:type="dxa" w:w="2154"/>
-            <w:tcW w:w="2154" w:type="dxa"/>
-            <w:tcW w:w="2154" w:type="dxa"/>
-          </w:tcPr>
-          <w:p>
-            <w:pPr>
+            <w:tcW w:type="dxa" w:w="3175"/>
+            <w:tcMar>
+              <w:top w:w="120" w:type="dxa"/>
+              <w:bottom w:w="120" w:type="dxa"/>
+              <w:left w:w="100" w:type="dxa"/>
+              <w:right w:w="100" w:type="dxa"/>
+            </w:tcMar>
+          </w:tcPr>
+          <w:p>
+            <w:pPr>
+              <w:spacing w:before="40" w:after="40" w:line="276" w:lineRule="auto"/>
               <w:jc w:val="center"/>
             </w:pPr>
             <w:r>
@@ -1429,12 +1442,17 @@
         </w:tc>
         <w:tc>
           <w:tcPr>
-            <w:tcW w:type="dxa" w:w="624"/>
-            <w:tcW w:w="623" w:type="dxa"/>
-            <w:tcW w:w="623" w:type="dxa"/>
-          </w:tcPr>
-          <w:p>
-            <w:pPr>
+            <w:tcW w:type="dxa" w:w="907"/>
+            <w:tcMar>
+              <w:top w:w="120" w:type="dxa"/>
+              <w:bottom w:w="120" w:type="dxa"/>
+              <w:left w:w="100" w:type="dxa"/>
+              <w:right w:w="100" w:type="dxa"/>
+            </w:tcMar>
+          </w:tcPr>
+          <w:p>
+            <w:pPr>
+              <w:spacing w:before="40" w:after="40" w:line="276" w:lineRule="auto"/>
               <w:jc w:val="center"/>
             </w:pPr>
             <w:r>
@@ -1449,32 +1467,17 @@
         </w:tc>
         <w:tc>
           <w:tcPr>
-            <w:tcW w:type="dxa" w:w="794"/>
-            <w:tcW w:w="793" w:type="dxa"/>
-            <w:tcW w:w="793" w:type="dxa"/>
-          </w:tcPr>
-          <w:p>
-            <w:pPr>
-              <w:jc w:val="center"/>
-            </w:pPr>
-            <w:r>
-              <w:rPr>
-                <w:rFonts w:ascii="Times New Roman" w:hAnsi="Times New Roman"/>
-                <w:b/>
-                <w:sz w:val="26"/>
-              </w:rPr>
-              <w:t>Tiết theo PPCT</w:t>
-            </w:r>
-          </w:p>
-        </w:tc>
-        <w:tc>
-          <w:tcPr>
-            <w:tcW w:type="dxa" w:w="5272"/>
-            <w:tcW w:w="5273" w:type="dxa"/>
-            <w:tcW w:w="5273" w:type="dxa"/>
-          </w:tcPr>
-          <w:p>
-            <w:pPr>
+            <w:tcW w:type="dxa" w:w="4649"/>
+            <w:tcMar>
+              <w:top w:w="120" w:type="dxa"/>
+              <w:bottom w:w="120" w:type="dxa"/>
+              <w:left w:w="100" w:type="dxa"/>
+              <w:right w:w="100" w:type="dxa"/>
+            </w:tcMar>
+          </w:tcPr>
+          <w:p>
+            <w:pPr>
+              <w:spacing w:before="40" w:after="40" w:line="276" w:lineRule="auto"/>
               <w:jc w:val="center"/>
             </w:pPr>
             <w:r>
@@ -1489,14 +1492,22 @@
         </w:tc>
       </w:tr>
       <w:tr>
-        <w:tc>
-          <w:tcPr>
-            <w:tcW w:type="dxa" w:w="510"/>
-            <w:tcW w:w="510" w:type="dxa"/>
-            <w:tcW w:w="510" w:type="dxa"/>
-          </w:tcPr>
-          <w:p>
-            <w:pPr>
+        <w:trPr>
+          <w:cantSplit/>
+        </w:trPr>
+        <w:tc>
+          <w:tcPr>
+            <w:tcW w:type="dxa" w:w="624"/>
+            <w:tcMar>
+              <w:top w:w="80" w:type="dxa"/>
+              <w:bottom w:w="80" w:type="dxa"/>
+              <w:left w:w="100" w:type="dxa"/>
+              <w:right w:w="100" w:type="dxa"/>
+            </w:tcMar>
+          </w:tcPr>
+          <w:p>
+            <w:pPr>
+              <w:spacing w:before="40" w:after="40" w:line="276" w:lineRule="auto"/>
               <w:jc w:val="center"/>
             </w:pPr>
             <w:r>
@@ -1510,13 +1521,18 @@
         </w:tc>
         <w:tc>
           <w:tcPr>
-            <w:tcW w:type="dxa" w:w="2154"/>
-            <w:tcW w:w="2154" w:type="dxa"/>
-            <w:tcW w:w="2154" w:type="dxa"/>
-          </w:tcPr>
-          <w:p>
-            <w:pPr>
-              <w:jc w:val="both"/>
+            <w:tcW w:type="dxa" w:w="3175"/>
+            <w:tcMar>
+              <w:top w:w="80" w:type="dxa"/>
+              <w:bottom w:w="80" w:type="dxa"/>
+              <w:left w:w="100" w:type="dxa"/>
+              <w:right w:w="100" w:type="dxa"/>
+            </w:tcMar>
+          </w:tcPr>
+          <w:p>
+            <w:pPr>
+              <w:spacing w:before="40" w:after="40" w:line="276" w:lineRule="auto"/>
+              <w:jc w:val="left"/>
             </w:pPr>
             <w:r>
               <w:rPr>
@@ -1529,12 +1545,17 @@
         </w:tc>
         <w:tc>
           <w:tcPr>
-            <w:tcW w:type="dxa" w:w="624"/>
-            <w:tcW w:w="623" w:type="dxa"/>
-            <w:tcW w:w="623" w:type="dxa"/>
-          </w:tcPr>
-          <w:p>
-            <w:pPr>
+            <w:tcW w:type="dxa" w:w="907"/>
+            <w:tcMar>
+              <w:top w:w="80" w:type="dxa"/>
+              <w:bottom w:w="80" w:type="dxa"/>
+              <w:left w:w="100" w:type="dxa"/>
+              <w:right w:w="100" w:type="dxa"/>
+            </w:tcMar>
+          </w:tcPr>
+          <w:p>
+            <w:pPr>
+              <w:spacing w:before="40" w:after="40" w:line="276" w:lineRule="auto"/>
               <w:jc w:val="center"/>
             </w:pPr>
             <w:r>
@@ -1548,32 +1569,18 @@
         </w:tc>
         <w:tc>
           <w:tcPr>
-            <w:tcW w:type="dxa" w:w="794"/>
-            <w:tcW w:w="793" w:type="dxa"/>
-            <w:tcW w:w="793" w:type="dxa"/>
-          </w:tcPr>
-          <w:p>
-            <w:pPr>
-              <w:jc w:val="center"/>
-            </w:pPr>
-            <w:r>
-              <w:rPr>
-                <w:rFonts w:ascii="Times New Roman" w:hAnsi="Times New Roman"/>
-                <w:sz w:val="26"/>
-              </w:rPr>
-              <w:t>1</w:t>
-            </w:r>
-          </w:p>
-        </w:tc>
-        <w:tc>
-          <w:tcPr>
-            <w:tcW w:type="dxa" w:w="5272"/>
-            <w:tcW w:w="5273" w:type="dxa"/>
-            <w:tcW w:w="5273" w:type="dxa"/>
-          </w:tcPr>
-          <w:p>
-            <w:pPr>
-              <w:jc w:val="both"/>
+            <w:tcW w:type="dxa" w:w="4649"/>
+            <w:tcMar>
+              <w:top w:w="80" w:type="dxa"/>
+              <w:bottom w:w="80" w:type="dxa"/>
+              <w:left w:w="100" w:type="dxa"/>
+              <w:right w:w="100" w:type="dxa"/>
+            </w:tcMar>
+          </w:tcPr>
+          <w:p>
+            <w:pPr>
+              <w:spacing w:before="40" w:after="40" w:line="276" w:lineRule="auto"/>
+              <w:jc w:val="left"/>
             </w:pPr>
             <w:r>
               <w:rPr>
@@ -1586,14 +1593,22 @@
         </w:tc>
       </w:tr>
       <w:tr>
-        <w:tc>
-          <w:tcPr>
-            <w:tcW w:type="dxa" w:w="510"/>
-            <w:tcW w:w="510" w:type="dxa"/>
-            <w:tcW w:w="510" w:type="dxa"/>
-          </w:tcPr>
-          <w:p>
-            <w:pPr>
+        <w:trPr>
+          <w:cantSplit/>
+        </w:trPr>
+        <w:tc>
+          <w:tcPr>
+            <w:tcW w:type="dxa" w:w="624"/>
+            <w:tcMar>
+              <w:top w:w="80" w:type="dxa"/>
+              <w:bottom w:w="80" w:type="dxa"/>
+              <w:left w:w="100" w:type="dxa"/>
+              <w:right w:w="100" w:type="dxa"/>
+            </w:tcMar>
+          </w:tcPr>
+          <w:p>
+            <w:pPr>
+              <w:spacing w:before="40" w:after="40" w:line="276" w:lineRule="auto"/>
               <w:jc w:val="center"/>
             </w:pPr>
             <w:r>
@@ -1607,13 +1622,18 @@
         </w:tc>
         <w:tc>
           <w:tcPr>
-            <w:tcW w:type="dxa" w:w="2154"/>
-            <w:tcW w:w="2154" w:type="dxa"/>
-            <w:tcW w:w="2154" w:type="dxa"/>
-          </w:tcPr>
-          <w:p>
-            <w:pPr>
-              <w:jc w:val="both"/>
+            <w:tcW w:type="dxa" w:w="3175"/>
+            <w:tcMar>
+              <w:top w:w="80" w:type="dxa"/>
+              <w:bottom w:w="80" w:type="dxa"/>
+              <w:left w:w="100" w:type="dxa"/>
+              <w:right w:w="100" w:type="dxa"/>
+            </w:tcMar>
+          </w:tcPr>
+          <w:p>
+            <w:pPr>
+              <w:spacing w:before="40" w:after="40" w:line="276" w:lineRule="auto"/>
+              <w:jc w:val="left"/>
             </w:pPr>
             <w:r>
               <w:rPr>
@@ -1626,12 +1646,17 @@
         </w:tc>
         <w:tc>
           <w:tcPr>
-            <w:tcW w:type="dxa" w:w="624"/>
-            <w:tcW w:w="623" w:type="dxa"/>
-            <w:tcW w:w="623" w:type="dxa"/>
-          </w:tcPr>
-          <w:p>
-            <w:pPr>
+            <w:tcW w:type="dxa" w:w="907"/>
+            <w:tcMar>
+              <w:top w:w="80" w:type="dxa"/>
+              <w:bottom w:w="80" w:type="dxa"/>
+              <w:left w:w="100" w:type="dxa"/>
+              <w:right w:w="100" w:type="dxa"/>
+            </w:tcMar>
+          </w:tcPr>
+          <w:p>
+            <w:pPr>
+              <w:spacing w:before="40" w:after="40" w:line="276" w:lineRule="auto"/>
               <w:jc w:val="center"/>
             </w:pPr>
             <w:r>
@@ -1645,32 +1670,18 @@
         </w:tc>
         <w:tc>
           <w:tcPr>
-            <w:tcW w:type="dxa" w:w="794"/>
-            <w:tcW w:w="793" w:type="dxa"/>
-            <w:tcW w:w="793" w:type="dxa"/>
-          </w:tcPr>
-          <w:p>
-            <w:pPr>
-              <w:jc w:val="center"/>
-            </w:pPr>
-            <w:r>
-              <w:rPr>
-                <w:rFonts w:ascii="Times New Roman" w:hAnsi="Times New Roman"/>
-                <w:sz w:val="26"/>
-              </w:rPr>
-              <w:t>2</w:t>
-            </w:r>
-          </w:p>
-        </w:tc>
-        <w:tc>
-          <w:tcPr>
-            <w:tcW w:type="dxa" w:w="5272"/>
-            <w:tcW w:w="5273" w:type="dxa"/>
-            <w:tcW w:w="5273" w:type="dxa"/>
-          </w:tcPr>
-          <w:p>
-            <w:pPr>
-              <w:jc w:val="both"/>
+            <w:tcW w:type="dxa" w:w="4649"/>
+            <w:tcMar>
+              <w:top w:w="80" w:type="dxa"/>
+              <w:bottom w:w="80" w:type="dxa"/>
+              <w:left w:w="100" w:type="dxa"/>
+              <w:right w:w="100" w:type="dxa"/>
+            </w:tcMar>
+          </w:tcPr>
+          <w:p>
+            <w:pPr>
+              <w:spacing w:before="40" w:after="40" w:line="276" w:lineRule="auto"/>
+              <w:jc w:val="left"/>
             </w:pPr>
             <w:r>
               <w:rPr>
@@ -1683,14 +1694,22 @@
         </w:tc>
       </w:tr>
       <w:tr>
-        <w:tc>
-          <w:tcPr>
-            <w:tcW w:type="dxa" w:w="510"/>
-            <w:tcW w:w="510" w:type="dxa"/>
-            <w:tcW w:w="510" w:type="dxa"/>
-          </w:tcPr>
-          <w:p>
-            <w:pPr>
+        <w:trPr>
+          <w:cantSplit/>
+        </w:trPr>
+        <w:tc>
+          <w:tcPr>
+            <w:tcW w:type="dxa" w:w="624"/>
+            <w:tcMar>
+              <w:top w:w="80" w:type="dxa"/>
+              <w:bottom w:w="80" w:type="dxa"/>
+              <w:left w:w="100" w:type="dxa"/>
+              <w:right w:w="100" w:type="dxa"/>
+            </w:tcMar>
+          </w:tcPr>
+          <w:p>
+            <w:pPr>
+              <w:spacing w:before="40" w:after="40" w:line="276" w:lineRule="auto"/>
               <w:jc w:val="center"/>
             </w:pPr>
             <w:r>
@@ -1704,13 +1723,18 @@
         </w:tc>
         <w:tc>
           <w:tcPr>
-            <w:tcW w:type="dxa" w:w="2154"/>
-            <w:tcW w:w="2154" w:type="dxa"/>
-            <w:tcW w:w="2154" w:type="dxa"/>
-          </w:tcPr>
-          <w:p>
-            <w:pPr>
-              <w:jc w:val="both"/>
+            <w:tcW w:type="dxa" w:w="3175"/>
+            <w:tcMar>
+              <w:top w:w="80" w:type="dxa"/>
+              <w:bottom w:w="80" w:type="dxa"/>
+              <w:left w:w="100" w:type="dxa"/>
+              <w:right w:w="100" w:type="dxa"/>
+            </w:tcMar>
+          </w:tcPr>
+          <w:p>
+            <w:pPr>
+              <w:spacing w:before="40" w:after="40" w:line="276" w:lineRule="auto"/>
+              <w:jc w:val="left"/>
             </w:pPr>
             <w:r>
               <w:rPr>
@@ -1723,12 +1747,17 @@
         </w:tc>
         <w:tc>
           <w:tcPr>
-            <w:tcW w:type="dxa" w:w="624"/>
-            <w:tcW w:w="623" w:type="dxa"/>
-            <w:tcW w:w="623" w:type="dxa"/>
-          </w:tcPr>
-          <w:p>
-            <w:pPr>
+            <w:tcW w:type="dxa" w:w="907"/>
+            <w:tcMar>
+              <w:top w:w="80" w:type="dxa"/>
+              <w:bottom w:w="80" w:type="dxa"/>
+              <w:left w:w="100" w:type="dxa"/>
+              <w:right w:w="100" w:type="dxa"/>
+            </w:tcMar>
+          </w:tcPr>
+          <w:p>
+            <w:pPr>
+              <w:spacing w:before="40" w:after="40" w:line="276" w:lineRule="auto"/>
               <w:jc w:val="center"/>
             </w:pPr>
             <w:r>
@@ -1742,32 +1771,18 @@
         </w:tc>
         <w:tc>
           <w:tcPr>
-            <w:tcW w:type="dxa" w:w="794"/>
-            <w:tcW w:w="793" w:type="dxa"/>
-            <w:tcW w:w="793" w:type="dxa"/>
-          </w:tcPr>
-          <w:p>
-            <w:pPr>
-              <w:jc w:val="center"/>
-            </w:pPr>
-            <w:r>
-              <w:rPr>
-                <w:rFonts w:ascii="Times New Roman" w:hAnsi="Times New Roman"/>
-                <w:sz w:val="26"/>
-              </w:rPr>
-              <w:t>3</w:t>
-            </w:r>
-          </w:p>
-        </w:tc>
-        <w:tc>
-          <w:tcPr>
-            <w:tcW w:type="dxa" w:w="5272"/>
-            <w:tcW w:w="5273" w:type="dxa"/>
-            <w:tcW w:w="5273" w:type="dxa"/>
-          </w:tcPr>
-          <w:p>
-            <w:pPr>
-              <w:jc w:val="both"/>
+            <w:tcW w:type="dxa" w:w="4649"/>
+            <w:tcMar>
+              <w:top w:w="80" w:type="dxa"/>
+              <w:bottom w:w="80" w:type="dxa"/>
+              <w:left w:w="100" w:type="dxa"/>
+              <w:right w:w="100" w:type="dxa"/>
+            </w:tcMar>
+          </w:tcPr>
+          <w:p>
+            <w:pPr>
+              <w:spacing w:before="40" w:after="40" w:line="276" w:lineRule="auto"/>
+              <w:jc w:val="left"/>
             </w:pPr>
             <w:r>
               <w:rPr>
@@ -1780,14 +1795,22 @@
         </w:tc>
       </w:tr>
       <w:tr>
-        <w:tc>
-          <w:tcPr>
-            <w:tcW w:type="dxa" w:w="510"/>
-            <w:tcW w:w="510" w:type="dxa"/>
-            <w:tcW w:w="510" w:type="dxa"/>
-          </w:tcPr>
-          <w:p>
-            <w:pPr>
+        <w:trPr>
+          <w:cantSplit/>
+        </w:trPr>
+        <w:tc>
+          <w:tcPr>
+            <w:tcW w:type="dxa" w:w="624"/>
+            <w:tcMar>
+              <w:top w:w="80" w:type="dxa"/>
+              <w:bottom w:w="80" w:type="dxa"/>
+              <w:left w:w="100" w:type="dxa"/>
+              <w:right w:w="100" w:type="dxa"/>
+            </w:tcMar>
+          </w:tcPr>
+          <w:p>
+            <w:pPr>
+              <w:spacing w:before="40" w:after="40" w:line="276" w:lineRule="auto"/>
               <w:jc w:val="center"/>
             </w:pPr>
             <w:r>
@@ -1801,13 +1824,18 @@
         </w:tc>
         <w:tc>
           <w:tcPr>
-            <w:tcW w:type="dxa" w:w="2154"/>
-            <w:tcW w:w="2154" w:type="dxa"/>
-            <w:tcW w:w="2154" w:type="dxa"/>
-          </w:tcPr>
-          <w:p>
-            <w:pPr>
-              <w:jc w:val="both"/>
+            <w:tcW w:type="dxa" w:w="3175"/>
+            <w:tcMar>
+              <w:top w:w="80" w:type="dxa"/>
+              <w:bottom w:w="80" w:type="dxa"/>
+              <w:left w:w="100" w:type="dxa"/>
+              <w:right w:w="100" w:type="dxa"/>
+            </w:tcMar>
+          </w:tcPr>
+          <w:p>
+            <w:pPr>
+              <w:spacing w:before="40" w:after="40" w:line="276" w:lineRule="auto"/>
+              <w:jc w:val="left"/>
             </w:pPr>
             <w:r>
               <w:rPr>
@@ -1820,12 +1848,17 @@
         </w:tc>
         <w:tc>
           <w:tcPr>
-            <w:tcW w:type="dxa" w:w="624"/>
-            <w:tcW w:w="623" w:type="dxa"/>
-            <w:tcW w:w="623" w:type="dxa"/>
-          </w:tcPr>
-          <w:p>
-            <w:pPr>
+            <w:tcW w:type="dxa" w:w="907"/>
+            <w:tcMar>
+              <w:top w:w="80" w:type="dxa"/>
+              <w:bottom w:w="80" w:type="dxa"/>
+              <w:left w:w="100" w:type="dxa"/>
+              <w:right w:w="100" w:type="dxa"/>
+            </w:tcMar>
+          </w:tcPr>
+          <w:p>
+            <w:pPr>
+              <w:spacing w:before="40" w:after="40" w:line="276" w:lineRule="auto"/>
               <w:jc w:val="center"/>
             </w:pPr>
             <w:r>
@@ -1839,32 +1872,18 @@
         </w:tc>
         <w:tc>
           <w:tcPr>
-            <w:tcW w:type="dxa" w:w="794"/>
-            <w:tcW w:w="793" w:type="dxa"/>
-            <w:tcW w:w="793" w:type="dxa"/>
-          </w:tcPr>
-          <w:p>
-            <w:pPr>
-              <w:jc w:val="center"/>
-            </w:pPr>
-            <w:r>
-              <w:rPr>
-                <w:rFonts w:ascii="Times New Roman" w:hAnsi="Times New Roman"/>
-                <w:sz w:val="26"/>
-              </w:rPr>
-              <w:t>4</w:t>
-            </w:r>
-          </w:p>
-        </w:tc>
-        <w:tc>
-          <w:tcPr>
-            <w:tcW w:type="dxa" w:w="5272"/>
-            <w:tcW w:w="5273" w:type="dxa"/>
-            <w:tcW w:w="5273" w:type="dxa"/>
-          </w:tcPr>
-          <w:p>
-            <w:pPr>
-              <w:jc w:val="both"/>
+            <w:tcW w:type="dxa" w:w="4649"/>
+            <w:tcMar>
+              <w:top w:w="80" w:type="dxa"/>
+              <w:bottom w:w="80" w:type="dxa"/>
+              <w:left w:w="100" w:type="dxa"/>
+              <w:right w:w="100" w:type="dxa"/>
+            </w:tcMar>
+          </w:tcPr>
+          <w:p>
+            <w:pPr>
+              <w:spacing w:before="40" w:after="40" w:line="276" w:lineRule="auto"/>
+              <w:jc w:val="left"/>
             </w:pPr>
             <w:r>
               <w:rPr>
@@ -1877,14 +1896,22 @@
         </w:tc>
       </w:tr>
       <w:tr>
-        <w:tc>
-          <w:tcPr>
-            <w:tcW w:type="dxa" w:w="510"/>
-            <w:tcW w:w="510" w:type="dxa"/>
-            <w:tcW w:w="510" w:type="dxa"/>
-          </w:tcPr>
-          <w:p>
-            <w:pPr>
+        <w:trPr>
+          <w:cantSplit/>
+        </w:trPr>
+        <w:tc>
+          <w:tcPr>
+            <w:tcW w:type="dxa" w:w="624"/>
+            <w:tcMar>
+              <w:top w:w="80" w:type="dxa"/>
+              <w:bottom w:w="80" w:type="dxa"/>
+              <w:left w:w="100" w:type="dxa"/>
+              <w:right w:w="100" w:type="dxa"/>
+            </w:tcMar>
+          </w:tcPr>
+          <w:p>
+            <w:pPr>
+              <w:spacing w:before="40" w:after="40" w:line="276" w:lineRule="auto"/>
               <w:jc w:val="center"/>
             </w:pPr>
             <w:r>
@@ -1898,13 +1925,18 @@
         </w:tc>
         <w:tc>
           <w:tcPr>
-            <w:tcW w:type="dxa" w:w="2154"/>
-            <w:tcW w:w="2154" w:type="dxa"/>
-            <w:tcW w:w="2154" w:type="dxa"/>
-          </w:tcPr>
-          <w:p>
-            <w:pPr>
-              <w:jc w:val="both"/>
+            <w:tcW w:type="dxa" w:w="3175"/>
+            <w:tcMar>
+              <w:top w:w="80" w:type="dxa"/>
+              <w:bottom w:w="80" w:type="dxa"/>
+              <w:left w:w="100" w:type="dxa"/>
+              <w:right w:w="100" w:type="dxa"/>
+            </w:tcMar>
+          </w:tcPr>
+          <w:p>
+            <w:pPr>
+              <w:spacing w:before="40" w:after="40" w:line="276" w:lineRule="auto"/>
+              <w:jc w:val="left"/>
             </w:pPr>
             <w:r>
               <w:rPr>
@@ -1917,12 +1949,17 @@
         </w:tc>
         <w:tc>
           <w:tcPr>
-            <w:tcW w:type="dxa" w:w="624"/>
-            <w:tcW w:w="623" w:type="dxa"/>
-            <w:tcW w:w="623" w:type="dxa"/>
-          </w:tcPr>
-          <w:p>
-            <w:pPr>
+            <w:tcW w:type="dxa" w:w="907"/>
+            <w:tcMar>
+              <w:top w:w="80" w:type="dxa"/>
+              <w:bottom w:w="80" w:type="dxa"/>
+              <w:left w:w="100" w:type="dxa"/>
+              <w:right w:w="100" w:type="dxa"/>
+            </w:tcMar>
+          </w:tcPr>
+          <w:p>
+            <w:pPr>
+              <w:spacing w:before="40" w:after="40" w:line="276" w:lineRule="auto"/>
               <w:jc w:val="center"/>
             </w:pPr>
             <w:r>
@@ -1936,32 +1973,18 @@
         </w:tc>
         <w:tc>
           <w:tcPr>
-            <w:tcW w:type="dxa" w:w="794"/>
-            <w:tcW w:w="793" w:type="dxa"/>
-            <w:tcW w:w="793" w:type="dxa"/>
-          </w:tcPr>
-          <w:p>
-            <w:pPr>
-              <w:jc w:val="center"/>
-            </w:pPr>
-            <w:r>
-              <w:rPr>
-                <w:rFonts w:ascii="Times New Roman" w:hAnsi="Times New Roman"/>
-                <w:sz w:val="26"/>
-              </w:rPr>
-              <w:t>5</w:t>
-            </w:r>
-          </w:p>
-        </w:tc>
-        <w:tc>
-          <w:tcPr>
-            <w:tcW w:type="dxa" w:w="5272"/>
-            <w:tcW w:w="5273" w:type="dxa"/>
-            <w:tcW w:w="5273" w:type="dxa"/>
-          </w:tcPr>
-          <w:p>
-            <w:pPr>
-              <w:jc w:val="both"/>
+            <w:tcW w:type="dxa" w:w="4649"/>
+            <w:tcMar>
+              <w:top w:w="80" w:type="dxa"/>
+              <w:bottom w:w="80" w:type="dxa"/>
+              <w:left w:w="100" w:type="dxa"/>
+              <w:right w:w="100" w:type="dxa"/>
+            </w:tcMar>
+          </w:tcPr>
+          <w:p>
+            <w:pPr>
+              <w:spacing w:before="40" w:after="40" w:line="276" w:lineRule="auto"/>
+              <w:jc w:val="left"/>
             </w:pPr>
             <w:r>
               <w:rPr>
@@ -1974,14 +1997,22 @@
         </w:tc>
       </w:tr>
       <w:tr>
-        <w:tc>
-          <w:tcPr>
-            <w:tcW w:type="dxa" w:w="510"/>
-            <w:tcW w:w="510" w:type="dxa"/>
-            <w:tcW w:w="510" w:type="dxa"/>
-          </w:tcPr>
-          <w:p>
-            <w:pPr>
+        <w:trPr>
+          <w:cantSplit/>
+        </w:trPr>
+        <w:tc>
+          <w:tcPr>
+            <w:tcW w:type="dxa" w:w="624"/>
+            <w:tcMar>
+              <w:top w:w="80" w:type="dxa"/>
+              <w:bottom w:w="80" w:type="dxa"/>
+              <w:left w:w="100" w:type="dxa"/>
+              <w:right w:w="100" w:type="dxa"/>
+            </w:tcMar>
+          </w:tcPr>
+          <w:p>
+            <w:pPr>
+              <w:spacing w:before="40" w:after="40" w:line="276" w:lineRule="auto"/>
               <w:jc w:val="center"/>
             </w:pPr>
             <w:r>
@@ -1995,13 +2026,18 @@
         </w:tc>
         <w:tc>
           <w:tcPr>
-            <w:tcW w:type="dxa" w:w="2154"/>
-            <w:tcW w:w="2154" w:type="dxa"/>
-            <w:tcW w:w="2154" w:type="dxa"/>
-          </w:tcPr>
-          <w:p>
-            <w:pPr>
-              <w:jc w:val="both"/>
+            <w:tcW w:type="dxa" w:w="3175"/>
+            <w:tcMar>
+              <w:top w:w="80" w:type="dxa"/>
+              <w:bottom w:w="80" w:type="dxa"/>
+              <w:left w:w="100" w:type="dxa"/>
+              <w:right w:w="100" w:type="dxa"/>
+            </w:tcMar>
+          </w:tcPr>
+          <w:p>
+            <w:pPr>
+              <w:spacing w:before="40" w:after="40" w:line="276" w:lineRule="auto"/>
+              <w:jc w:val="left"/>
             </w:pPr>
             <w:r>
               <w:rPr>
@@ -2014,12 +2050,17 @@
         </w:tc>
         <w:tc>
           <w:tcPr>
-            <w:tcW w:type="dxa" w:w="624"/>
-            <w:tcW w:w="623" w:type="dxa"/>
-            <w:tcW w:w="623" w:type="dxa"/>
-          </w:tcPr>
-          <w:p>
-            <w:pPr>
+            <w:tcW w:type="dxa" w:w="907"/>
+            <w:tcMar>
+              <w:top w:w="80" w:type="dxa"/>
+              <w:bottom w:w="80" w:type="dxa"/>
+              <w:left w:w="100" w:type="dxa"/>
+              <w:right w:w="100" w:type="dxa"/>
+            </w:tcMar>
+          </w:tcPr>
+          <w:p>
+            <w:pPr>
+              <w:spacing w:before="40" w:after="40" w:line="276" w:lineRule="auto"/>
               <w:jc w:val="center"/>
             </w:pPr>
             <w:r>
@@ -2033,32 +2074,18 @@
         </w:tc>
         <w:tc>
           <w:tcPr>
-            <w:tcW w:type="dxa" w:w="794"/>
-            <w:tcW w:w="793" w:type="dxa"/>
-            <w:tcW w:w="793" w:type="dxa"/>
-          </w:tcPr>
-          <w:p>
-            <w:pPr>
-              <w:jc w:val="center"/>
-            </w:pPr>
-            <w:r>
-              <w:rPr>
-                <w:rFonts w:ascii="Times New Roman" w:hAnsi="Times New Roman"/>
-                <w:sz w:val="26"/>
-              </w:rPr>
-              <w:t>6</w:t>
-            </w:r>
-          </w:p>
-        </w:tc>
-        <w:tc>
-          <w:tcPr>
-            <w:tcW w:type="dxa" w:w="5272"/>
-            <w:tcW w:w="5273" w:type="dxa"/>
-            <w:tcW w:w="5273" w:type="dxa"/>
-          </w:tcPr>
-          <w:p>
-            <w:pPr>
-              <w:jc w:val="both"/>
+            <w:tcW w:type="dxa" w:w="4649"/>
+            <w:tcMar>
+              <w:top w:w="80" w:type="dxa"/>
+              <w:bottom w:w="80" w:type="dxa"/>
+              <w:left w:w="100" w:type="dxa"/>
+              <w:right w:w="100" w:type="dxa"/>
+            </w:tcMar>
+          </w:tcPr>
+          <w:p>
+            <w:pPr>
+              <w:spacing w:before="40" w:after="40" w:line="276" w:lineRule="auto"/>
+              <w:jc w:val="left"/>
             </w:pPr>
             <w:r>
               <w:rPr>
@@ -2071,14 +2098,22 @@
         </w:tc>
       </w:tr>
       <w:tr>
-        <w:tc>
-          <w:tcPr>
-            <w:tcW w:type="dxa" w:w="510"/>
-            <w:tcW w:w="510" w:type="dxa"/>
-            <w:tcW w:w="510" w:type="dxa"/>
-          </w:tcPr>
-          <w:p>
-            <w:pPr>
+        <w:trPr>
+          <w:cantSplit/>
+        </w:trPr>
+        <w:tc>
+          <w:tcPr>
+            <w:tcW w:type="dxa" w:w="624"/>
+            <w:tcMar>
+              <w:top w:w="80" w:type="dxa"/>
+              <w:bottom w:w="80" w:type="dxa"/>
+              <w:left w:w="100" w:type="dxa"/>
+              <w:right w:w="100" w:type="dxa"/>
+            </w:tcMar>
+          </w:tcPr>
+          <w:p>
+            <w:pPr>
+              <w:spacing w:before="40" w:after="40" w:line="276" w:lineRule="auto"/>
               <w:jc w:val="center"/>
             </w:pPr>
             <w:r>
@@ -2092,13 +2127,18 @@
         </w:tc>
         <w:tc>
           <w:tcPr>
-            <w:tcW w:type="dxa" w:w="2154"/>
-            <w:tcW w:w="2154" w:type="dxa"/>
-            <w:tcW w:w="2154" w:type="dxa"/>
-          </w:tcPr>
-          <w:p>
-            <w:pPr>
-              <w:jc w:val="both"/>
+            <w:tcW w:type="dxa" w:w="3175"/>
+            <w:tcMar>
+              <w:top w:w="80" w:type="dxa"/>
+              <w:bottom w:w="80" w:type="dxa"/>
+              <w:left w:w="100" w:type="dxa"/>
+              <w:right w:w="100" w:type="dxa"/>
+            </w:tcMar>
+          </w:tcPr>
+          <w:p>
+            <w:pPr>
+              <w:spacing w:before="40" w:after="40" w:line="276" w:lineRule="auto"/>
+              <w:jc w:val="left"/>
             </w:pPr>
             <w:r>
               <w:rPr>
@@ -2111,12 +2151,17 @@
         </w:tc>
         <w:tc>
           <w:tcPr>
-            <w:tcW w:type="dxa" w:w="624"/>
-            <w:tcW w:w="623" w:type="dxa"/>
-            <w:tcW w:w="623" w:type="dxa"/>
-          </w:tcPr>
-          <w:p>
-            <w:pPr>
+            <w:tcW w:type="dxa" w:w="907"/>
+            <w:tcMar>
+              <w:top w:w="80" w:type="dxa"/>
+              <w:bottom w:w="80" w:type="dxa"/>
+              <w:left w:w="100" w:type="dxa"/>
+              <w:right w:w="100" w:type="dxa"/>
+            </w:tcMar>
+          </w:tcPr>
+          <w:p>
+            <w:pPr>
+              <w:spacing w:before="40" w:after="40" w:line="276" w:lineRule="auto"/>
               <w:jc w:val="center"/>
             </w:pPr>
             <w:r>
@@ -2130,32 +2175,18 @@
         </w:tc>
         <w:tc>
           <w:tcPr>
-            <w:tcW w:type="dxa" w:w="794"/>
-            <w:tcW w:w="793" w:type="dxa"/>
-            <w:tcW w:w="793" w:type="dxa"/>
-          </w:tcPr>
-          <w:p>
-            <w:pPr>
-              <w:jc w:val="center"/>
-            </w:pPr>
-            <w:r>
-              <w:rPr>
-                <w:rFonts w:ascii="Times New Roman" w:hAnsi="Times New Roman"/>
-                <w:sz w:val="26"/>
-              </w:rPr>
-              <w:t>7</w:t>
-            </w:r>
-          </w:p>
-        </w:tc>
-        <w:tc>
-          <w:tcPr>
-            <w:tcW w:type="dxa" w:w="5272"/>
-            <w:tcW w:w="5273" w:type="dxa"/>
-            <w:tcW w:w="5273" w:type="dxa"/>
-          </w:tcPr>
-          <w:p>
-            <w:pPr>
-              <w:jc w:val="both"/>
+            <w:tcW w:type="dxa" w:w="4649"/>
+            <w:tcMar>
+              <w:top w:w="80" w:type="dxa"/>
+              <w:bottom w:w="80" w:type="dxa"/>
+              <w:left w:w="100" w:type="dxa"/>
+              <w:right w:w="100" w:type="dxa"/>
+            </w:tcMar>
+          </w:tcPr>
+          <w:p>
+            <w:pPr>
+              <w:spacing w:before="40" w:after="40" w:line="276" w:lineRule="auto"/>
+              <w:jc w:val="left"/>
             </w:pPr>
             <w:r>
               <w:rPr>
@@ -2168,14 +2199,22 @@
         </w:tc>
       </w:tr>
       <w:tr>
-        <w:tc>
-          <w:tcPr>
-            <w:tcW w:type="dxa" w:w="510"/>
-            <w:tcW w:w="510" w:type="dxa"/>
-            <w:tcW w:w="510" w:type="dxa"/>
-          </w:tcPr>
-          <w:p>
-            <w:pPr>
+        <w:trPr>
+          <w:cantSplit/>
+        </w:trPr>
+        <w:tc>
+          <w:tcPr>
+            <w:tcW w:type="dxa" w:w="624"/>
+            <w:tcMar>
+              <w:top w:w="80" w:type="dxa"/>
+              <w:bottom w:w="80" w:type="dxa"/>
+              <w:left w:w="100" w:type="dxa"/>
+              <w:right w:w="100" w:type="dxa"/>
+            </w:tcMar>
+          </w:tcPr>
+          <w:p>
+            <w:pPr>
+              <w:spacing w:before="40" w:after="40" w:line="276" w:lineRule="auto"/>
               <w:jc w:val="center"/>
             </w:pPr>
             <w:r>
@@ -2189,13 +2228,18 @@
         </w:tc>
         <w:tc>
           <w:tcPr>
-            <w:tcW w:type="dxa" w:w="2154"/>
-            <w:tcW w:w="2154" w:type="dxa"/>
-            <w:tcW w:w="2154" w:type="dxa"/>
-          </w:tcPr>
-          <w:p>
-            <w:pPr>
-              <w:jc w:val="both"/>
+            <w:tcW w:type="dxa" w:w="3175"/>
+            <w:tcMar>
+              <w:top w:w="80" w:type="dxa"/>
+              <w:bottom w:w="80" w:type="dxa"/>
+              <w:left w:w="100" w:type="dxa"/>
+              <w:right w:w="100" w:type="dxa"/>
+            </w:tcMar>
+          </w:tcPr>
+          <w:p>
+            <w:pPr>
+              <w:spacing w:before="40" w:after="40" w:line="276" w:lineRule="auto"/>
+              <w:jc w:val="left"/>
             </w:pPr>
             <w:r>
               <w:rPr>
@@ -2208,12 +2252,17 @@
         </w:tc>
         <w:tc>
           <w:tcPr>
-            <w:tcW w:type="dxa" w:w="624"/>
-            <w:tcW w:w="623" w:type="dxa"/>
-            <w:tcW w:w="623" w:type="dxa"/>
-          </w:tcPr>
-          <w:p>
-            <w:pPr>
+            <w:tcW w:type="dxa" w:w="907"/>
+            <w:tcMar>
+              <w:top w:w="80" w:type="dxa"/>
+              <w:bottom w:w="80" w:type="dxa"/>
+              <w:left w:w="100" w:type="dxa"/>
+              <w:right w:w="100" w:type="dxa"/>
+            </w:tcMar>
+          </w:tcPr>
+          <w:p>
+            <w:pPr>
+              <w:spacing w:before="40" w:after="40" w:line="276" w:lineRule="auto"/>
               <w:jc w:val="center"/>
             </w:pPr>
             <w:r>
@@ -2227,32 +2276,18 @@
         </w:tc>
         <w:tc>
           <w:tcPr>
-            <w:tcW w:type="dxa" w:w="794"/>
-            <w:tcW w:w="793" w:type="dxa"/>
-            <w:tcW w:w="793" w:type="dxa"/>
-          </w:tcPr>
-          <w:p>
-            <w:pPr>
-              <w:jc w:val="center"/>
-            </w:pPr>
-            <w:r>
-              <w:rPr>
-                <w:rFonts w:ascii="Times New Roman" w:hAnsi="Times New Roman"/>
-                <w:sz w:val="26"/>
-              </w:rPr>
-              <w:t>8</w:t>
-            </w:r>
-          </w:p>
-        </w:tc>
-        <w:tc>
-          <w:tcPr>
-            <w:tcW w:type="dxa" w:w="5272"/>
-            <w:tcW w:w="5273" w:type="dxa"/>
-            <w:tcW w:w="5273" w:type="dxa"/>
-          </w:tcPr>
-          <w:p>
-            <w:pPr>
-              <w:jc w:val="both"/>
+            <w:tcW w:type="dxa" w:w="4649"/>
+            <w:tcMar>
+              <w:top w:w="80" w:type="dxa"/>
+              <w:bottom w:w="80" w:type="dxa"/>
+              <w:left w:w="100" w:type="dxa"/>
+              <w:right w:w="100" w:type="dxa"/>
+            </w:tcMar>
+          </w:tcPr>
+          <w:p>
+            <w:pPr>
+              <w:spacing w:before="40" w:after="40" w:line="276" w:lineRule="auto"/>
+              <w:jc w:val="left"/>
             </w:pPr>
             <w:r>
               <w:rPr>
@@ -2265,14 +2300,22 @@
         </w:tc>
       </w:tr>
       <w:tr>
-        <w:tc>
-          <w:tcPr>
-            <w:tcW w:type="dxa" w:w="510"/>
-            <w:tcW w:w="510" w:type="dxa"/>
-            <w:tcW w:w="510" w:type="dxa"/>
-          </w:tcPr>
-          <w:p>
-            <w:pPr>
+        <w:trPr>
+          <w:cantSplit/>
+        </w:trPr>
+        <w:tc>
+          <w:tcPr>
+            <w:tcW w:type="dxa" w:w="624"/>
+            <w:tcMar>
+              <w:top w:w="80" w:type="dxa"/>
+              <w:bottom w:w="80" w:type="dxa"/>
+              <w:left w:w="100" w:type="dxa"/>
+              <w:right w:w="100" w:type="dxa"/>
+            </w:tcMar>
+          </w:tcPr>
+          <w:p>
+            <w:pPr>
+              <w:spacing w:before="40" w:after="40" w:line="276" w:lineRule="auto"/>
               <w:jc w:val="center"/>
             </w:pPr>
             <w:r>
@@ -2286,13 +2329,18 @@
         </w:tc>
         <w:tc>
           <w:tcPr>
-            <w:tcW w:type="dxa" w:w="2154"/>
-            <w:tcW w:w="2154" w:type="dxa"/>
-            <w:tcW w:w="2154" w:type="dxa"/>
-          </w:tcPr>
-          <w:p>
-            <w:pPr>
-              <w:jc w:val="both"/>
+            <w:tcW w:type="dxa" w:w="3175"/>
+            <w:tcMar>
+              <w:top w:w="80" w:type="dxa"/>
+              <w:bottom w:w="80" w:type="dxa"/>
+              <w:left w:w="100" w:type="dxa"/>
+              <w:right w:w="100" w:type="dxa"/>
+            </w:tcMar>
+          </w:tcPr>
+          <w:p>
+            <w:pPr>
+              <w:spacing w:before="40" w:after="40" w:line="276" w:lineRule="auto"/>
+              <w:jc w:val="left"/>
             </w:pPr>
             <w:r>
               <w:rPr>
@@ -2305,12 +2353,17 @@
         </w:tc>
         <w:tc>
           <w:tcPr>
-            <w:tcW w:type="dxa" w:w="624"/>
-            <w:tcW w:w="623" w:type="dxa"/>
-            <w:tcW w:w="623" w:type="dxa"/>
-          </w:tcPr>
-          <w:p>
-            <w:pPr>
+            <w:tcW w:type="dxa" w:w="907"/>
+            <w:tcMar>
+              <w:top w:w="80" w:type="dxa"/>
+              <w:bottom w:w="80" w:type="dxa"/>
+              <w:left w:w="100" w:type="dxa"/>
+              <w:right w:w="100" w:type="dxa"/>
+            </w:tcMar>
+          </w:tcPr>
+          <w:p>
+            <w:pPr>
+              <w:spacing w:before="40" w:after="40" w:line="276" w:lineRule="auto"/>
               <w:jc w:val="center"/>
             </w:pPr>
             <w:r>
@@ -2324,32 +2377,18 @@
         </w:tc>
         <w:tc>
           <w:tcPr>
-            <w:tcW w:type="dxa" w:w="794"/>
-            <w:tcW w:w="793" w:type="dxa"/>
-            <w:tcW w:w="793" w:type="dxa"/>
-          </w:tcPr>
-          <w:p>
-            <w:pPr>
-              <w:jc w:val="center"/>
-            </w:pPr>
-            <w:r>
-              <w:rPr>
-                <w:rFonts w:ascii="Times New Roman" w:hAnsi="Times New Roman"/>
-                <w:sz w:val="26"/>
-              </w:rPr>
-              <w:t>9</w:t>
-            </w:r>
-          </w:p>
-        </w:tc>
-        <w:tc>
-          <w:tcPr>
-            <w:tcW w:type="dxa" w:w="5272"/>
-            <w:tcW w:w="5273" w:type="dxa"/>
-            <w:tcW w:w="5273" w:type="dxa"/>
-          </w:tcPr>
-          <w:p>
-            <w:pPr>
-              <w:jc w:val="both"/>
+            <w:tcW w:type="dxa" w:w="4649"/>
+            <w:tcMar>
+              <w:top w:w="80" w:type="dxa"/>
+              <w:bottom w:w="80" w:type="dxa"/>
+              <w:left w:w="100" w:type="dxa"/>
+              <w:right w:w="100" w:type="dxa"/>
+            </w:tcMar>
+          </w:tcPr>
+          <w:p>
+            <w:pPr>
+              <w:spacing w:before="40" w:after="40" w:line="276" w:lineRule="auto"/>
+              <w:jc w:val="left"/>
             </w:pPr>
             <w:r>
               <w:rPr>
@@ -2362,14 +2401,22 @@
         </w:tc>
       </w:tr>
       <w:tr>
-        <w:tc>
-          <w:tcPr>
-            <w:tcW w:type="dxa" w:w="510"/>
-            <w:tcW w:w="510" w:type="dxa"/>
-            <w:tcW w:w="510" w:type="dxa"/>
-          </w:tcPr>
-          <w:p>
-            <w:pPr>
+        <w:trPr>
+          <w:cantSplit/>
+        </w:trPr>
+        <w:tc>
+          <w:tcPr>
+            <w:tcW w:type="dxa" w:w="624"/>
+            <w:tcMar>
+              <w:top w:w="80" w:type="dxa"/>
+              <w:bottom w:w="80" w:type="dxa"/>
+              <w:left w:w="100" w:type="dxa"/>
+              <w:right w:w="100" w:type="dxa"/>
+            </w:tcMar>
+          </w:tcPr>
+          <w:p>
+            <w:pPr>
+              <w:spacing w:before="40" w:after="40" w:line="276" w:lineRule="auto"/>
               <w:jc w:val="center"/>
             </w:pPr>
             <w:r>
@@ -2383,17 +2430,23 @@
         </w:tc>
         <w:tc>
           <w:tcPr>
-            <w:tcW w:type="dxa" w:w="2154"/>
-            <w:tcW w:w="2154" w:type="dxa"/>
-            <w:tcW w:w="2154" w:type="dxa"/>
-          </w:tcPr>
-          <w:p>
-            <w:pPr>
-              <w:jc w:val="both"/>
-            </w:pPr>
-            <w:r>
-              <w:rPr>
-                <w:rFonts w:ascii="Times New Roman" w:hAnsi="Times New Roman"/>
+            <w:tcW w:type="dxa" w:w="3175"/>
+            <w:tcMar>
+              <w:top w:w="80" w:type="dxa"/>
+              <w:bottom w:w="80" w:type="dxa"/>
+              <w:left w:w="100" w:type="dxa"/>
+              <w:right w:w="100" w:type="dxa"/>
+            </w:tcMar>
+          </w:tcPr>
+          <w:p>
+            <w:pPr>
+              <w:spacing w:before="40" w:after="40" w:line="276" w:lineRule="auto"/>
+              <w:jc w:val="left"/>
+            </w:pPr>
+            <w:r>
+              <w:rPr>
+                <w:rFonts w:ascii="Times New Roman" w:hAnsi="Times New Roman"/>
+                <w:b/>
                 <w:sz w:val="26"/>
               </w:rPr>
               <w:t>Ôn tập kỹ năng số</w:t>
@@ -2402,12 +2455,17 @@
         </w:tc>
         <w:tc>
           <w:tcPr>
-            <w:tcW w:type="dxa" w:w="624"/>
-            <w:tcW w:w="623" w:type="dxa"/>
-            <w:tcW w:w="623" w:type="dxa"/>
-          </w:tcPr>
-          <w:p>
-            <w:pPr>
+            <w:tcW w:type="dxa" w:w="907"/>
+            <w:tcMar>
+              <w:top w:w="80" w:type="dxa"/>
+              <w:bottom w:w="80" w:type="dxa"/>
+              <w:left w:w="100" w:type="dxa"/>
+              <w:right w:w="100" w:type="dxa"/>
+            </w:tcMar>
+          </w:tcPr>
+          <w:p>
+            <w:pPr>
+              <w:spacing w:before="40" w:after="40" w:line="276" w:lineRule="auto"/>
               <w:jc w:val="center"/>
             </w:pPr>
             <w:r>
@@ -2421,32 +2479,18 @@
         </w:tc>
         <w:tc>
           <w:tcPr>
-            <w:tcW w:type="dxa" w:w="794"/>
-            <w:tcW w:w="793" w:type="dxa"/>
-            <w:tcW w:w="793" w:type="dxa"/>
-          </w:tcPr>
-          <w:p>
-            <w:pPr>
-              <w:jc w:val="center"/>
-            </w:pPr>
-            <w:r>
-              <w:rPr>
-                <w:rFonts w:ascii="Times New Roman" w:hAnsi="Times New Roman"/>
-                <w:sz w:val="26"/>
-              </w:rPr>
-              <w:t>10</w:t>
-            </w:r>
-          </w:p>
-        </w:tc>
-        <w:tc>
-          <w:tcPr>
-            <w:tcW w:type="dxa" w:w="5272"/>
-            <w:tcW w:w="5273" w:type="dxa"/>
-            <w:tcW w:w="5273" w:type="dxa"/>
-          </w:tcPr>
-          <w:p>
-            <w:pPr>
-              <w:jc w:val="both"/>
+            <w:tcW w:type="dxa" w:w="4649"/>
+            <w:tcMar>
+              <w:top w:w="80" w:type="dxa"/>
+              <w:bottom w:w="80" w:type="dxa"/>
+              <w:left w:w="100" w:type="dxa"/>
+              <w:right w:w="100" w:type="dxa"/>
+            </w:tcMar>
+          </w:tcPr>
+          <w:p>
+            <w:pPr>
+              <w:spacing w:before="40" w:after="40" w:line="276" w:lineRule="auto"/>
+              <w:jc w:val="left"/>
             </w:pPr>
             <w:r>
               <w:rPr>
@@ -2459,14 +2503,22 @@
         </w:tc>
       </w:tr>
       <w:tr>
-        <w:tc>
-          <w:tcPr>
-            <w:tcW w:type="dxa" w:w="510"/>
-            <w:tcW w:w="510" w:type="dxa"/>
-            <w:tcW w:w="510" w:type="dxa"/>
-          </w:tcPr>
-          <w:p>
-            <w:pPr>
+        <w:trPr>
+          <w:cantSplit/>
+        </w:trPr>
+        <w:tc>
+          <w:tcPr>
+            <w:tcW w:type="dxa" w:w="624"/>
+            <w:tcMar>
+              <w:top w:w="80" w:type="dxa"/>
+              <w:bottom w:w="80" w:type="dxa"/>
+              <w:left w:w="100" w:type="dxa"/>
+              <w:right w:w="100" w:type="dxa"/>
+            </w:tcMar>
+          </w:tcPr>
+          <w:p>
+            <w:pPr>
+              <w:spacing w:before="40" w:after="40" w:line="276" w:lineRule="auto"/>
               <w:jc w:val="center"/>
             </w:pPr>
             <w:r>
@@ -2480,17 +2532,23 @@
         </w:tc>
         <w:tc>
           <w:tcPr>
-            <w:tcW w:type="dxa" w:w="2154"/>
-            <w:tcW w:w="2154" w:type="dxa"/>
-            <w:tcW w:w="2154" w:type="dxa"/>
-          </w:tcPr>
-          <w:p>
-            <w:pPr>
-              <w:jc w:val="both"/>
-            </w:pPr>
-            <w:r>
-              <w:rPr>
-                <w:rFonts w:ascii="Times New Roman" w:hAnsi="Times New Roman"/>
+            <w:tcW w:type="dxa" w:w="3175"/>
+            <w:tcMar>
+              <w:top w:w="80" w:type="dxa"/>
+              <w:bottom w:w="80" w:type="dxa"/>
+              <w:left w:w="100" w:type="dxa"/>
+              <w:right w:w="100" w:type="dxa"/>
+            </w:tcMar>
+          </w:tcPr>
+          <w:p>
+            <w:pPr>
+              <w:spacing w:before="40" w:after="40" w:line="276" w:lineRule="auto"/>
+              <w:jc w:val="left"/>
+            </w:pPr>
+            <w:r>
+              <w:rPr>
+                <w:rFonts w:ascii="Times New Roman" w:hAnsi="Times New Roman"/>
+                <w:b/>
                 <w:sz w:val="26"/>
               </w:rPr>
               <w:t>ĐÁNH GIÁ ĐỊNH KỲ 1</w:t>
@@ -2499,12 +2557,17 @@
         </w:tc>
         <w:tc>
           <w:tcPr>
-            <w:tcW w:type="dxa" w:w="624"/>
-            <w:tcW w:w="623" w:type="dxa"/>
-            <w:tcW w:w="623" w:type="dxa"/>
-          </w:tcPr>
-          <w:p>
-            <w:pPr>
+            <w:tcW w:type="dxa" w:w="907"/>
+            <w:tcMar>
+              <w:top w:w="80" w:type="dxa"/>
+              <w:bottom w:w="80" w:type="dxa"/>
+              <w:left w:w="100" w:type="dxa"/>
+              <w:right w:w="100" w:type="dxa"/>
+            </w:tcMar>
+          </w:tcPr>
+          <w:p>
+            <w:pPr>
+              <w:spacing w:before="40" w:after="40" w:line="276" w:lineRule="auto"/>
               <w:jc w:val="center"/>
             </w:pPr>
             <w:r>
@@ -2518,32 +2581,18 @@
         </w:tc>
         <w:tc>
           <w:tcPr>
-            <w:tcW w:type="dxa" w:w="794"/>
-            <w:tcW w:w="793" w:type="dxa"/>
-            <w:tcW w:w="793" w:type="dxa"/>
-          </w:tcPr>
-          <w:p>
-            <w:pPr>
-              <w:jc w:val="center"/>
-            </w:pPr>
-            <w:r>
-              <w:rPr>
-                <w:rFonts w:ascii="Times New Roman" w:hAnsi="Times New Roman"/>
-                <w:sz w:val="26"/>
-              </w:rPr>
-              <w:t>11</w:t>
-            </w:r>
-          </w:p>
-        </w:tc>
-        <w:tc>
-          <w:tcPr>
-            <w:tcW w:type="dxa" w:w="5272"/>
-            <w:tcW w:w="5273" w:type="dxa"/>
-            <w:tcW w:w="5273" w:type="dxa"/>
-          </w:tcPr>
-          <w:p>
-            <w:pPr>
-              <w:jc w:val="both"/>
+            <w:tcW w:type="dxa" w:w="4649"/>
+            <w:tcMar>
+              <w:top w:w="80" w:type="dxa"/>
+              <w:bottom w:w="80" w:type="dxa"/>
+              <w:left w:w="100" w:type="dxa"/>
+              <w:right w:w="100" w:type="dxa"/>
+            </w:tcMar>
+          </w:tcPr>
+          <w:p>
+            <w:pPr>
+              <w:spacing w:before="40" w:after="40" w:line="276" w:lineRule="auto"/>
+              <w:jc w:val="left"/>
             </w:pPr>
             <w:r>
               <w:rPr>
@@ -2556,14 +2605,22 @@
         </w:tc>
       </w:tr>
       <w:tr>
-        <w:tc>
-          <w:tcPr>
-            <w:tcW w:type="dxa" w:w="510"/>
-            <w:tcW w:w="510" w:type="dxa"/>
-            <w:tcW w:w="510" w:type="dxa"/>
-          </w:tcPr>
-          <w:p>
-            <w:pPr>
+        <w:trPr>
+          <w:cantSplit/>
+        </w:trPr>
+        <w:tc>
+          <w:tcPr>
+            <w:tcW w:type="dxa" w:w="624"/>
+            <w:tcMar>
+              <w:top w:w="80" w:type="dxa"/>
+              <w:bottom w:w="80" w:type="dxa"/>
+              <w:left w:w="100" w:type="dxa"/>
+              <w:right w:w="100" w:type="dxa"/>
+            </w:tcMar>
+          </w:tcPr>
+          <w:p>
+            <w:pPr>
+              <w:spacing w:before="40" w:after="40" w:line="276" w:lineRule="auto"/>
               <w:jc w:val="center"/>
             </w:pPr>
             <w:r>
@@ -2577,13 +2634,18 @@
         </w:tc>
         <w:tc>
           <w:tcPr>
-            <w:tcW w:type="dxa" w:w="2154"/>
-            <w:tcW w:w="2154" w:type="dxa"/>
-            <w:tcW w:w="2154" w:type="dxa"/>
-          </w:tcPr>
-          <w:p>
-            <w:pPr>
-              <w:jc w:val="both"/>
+            <w:tcW w:type="dxa" w:w="3175"/>
+            <w:tcMar>
+              <w:top w:w="80" w:type="dxa"/>
+              <w:bottom w:w="80" w:type="dxa"/>
+              <w:left w:w="100" w:type="dxa"/>
+              <w:right w:w="100" w:type="dxa"/>
+            </w:tcMar>
+          </w:tcPr>
+          <w:p>
+            <w:pPr>
+              <w:spacing w:before="40" w:after="40" w:line="276" w:lineRule="auto"/>
+              <w:jc w:val="left"/>
             </w:pPr>
             <w:r>
               <w:rPr>
@@ -2596,12 +2658,17 @@
         </w:tc>
         <w:tc>
           <w:tcPr>
-            <w:tcW w:type="dxa" w:w="624"/>
-            <w:tcW w:w="623" w:type="dxa"/>
-            <w:tcW w:w="623" w:type="dxa"/>
-          </w:tcPr>
-          <w:p>
-            <w:pPr>
+            <w:tcW w:type="dxa" w:w="907"/>
+            <w:tcMar>
+              <w:top w:w="80" w:type="dxa"/>
+              <w:bottom w:w="80" w:type="dxa"/>
+              <w:left w:w="100" w:type="dxa"/>
+              <w:right w:w="100" w:type="dxa"/>
+            </w:tcMar>
+          </w:tcPr>
+          <w:p>
+            <w:pPr>
+              <w:spacing w:before="40" w:after="40" w:line="276" w:lineRule="auto"/>
               <w:jc w:val="center"/>
             </w:pPr>
             <w:r>
@@ -2615,32 +2682,18 @@
         </w:tc>
         <w:tc>
           <w:tcPr>
-            <w:tcW w:type="dxa" w:w="794"/>
-            <w:tcW w:w="793" w:type="dxa"/>
-            <w:tcW w:w="793" w:type="dxa"/>
-          </w:tcPr>
-          <w:p>
-            <w:pPr>
-              <w:jc w:val="center"/>
-            </w:pPr>
-            <w:r>
-              <w:rPr>
-                <w:rFonts w:ascii="Times New Roman" w:hAnsi="Times New Roman"/>
-                <w:sz w:val="26"/>
-              </w:rPr>
-              <w:t>12</w:t>
-            </w:r>
-          </w:p>
-        </w:tc>
-        <w:tc>
-          <w:tcPr>
-            <w:tcW w:type="dxa" w:w="5272"/>
-            <w:tcW w:w="5273" w:type="dxa"/>
-            <w:tcW w:w="5273" w:type="dxa"/>
-          </w:tcPr>
-          <w:p>
-            <w:pPr>
-              <w:jc w:val="both"/>
+            <w:tcW w:type="dxa" w:w="4649"/>
+            <w:tcMar>
+              <w:top w:w="80" w:type="dxa"/>
+              <w:bottom w:w="80" w:type="dxa"/>
+              <w:left w:w="100" w:type="dxa"/>
+              <w:right w:w="100" w:type="dxa"/>
+            </w:tcMar>
+          </w:tcPr>
+          <w:p>
+            <w:pPr>
+              <w:spacing w:before="40" w:after="40" w:line="276" w:lineRule="auto"/>
+              <w:jc w:val="left"/>
             </w:pPr>
             <w:r>
               <w:rPr>
@@ -2653,14 +2706,22 @@
         </w:tc>
       </w:tr>
       <w:tr>
-        <w:tc>
-          <w:tcPr>
-            <w:tcW w:type="dxa" w:w="510"/>
-            <w:tcW w:w="510" w:type="dxa"/>
-            <w:tcW w:w="510" w:type="dxa"/>
-          </w:tcPr>
-          <w:p>
-            <w:pPr>
+        <w:trPr>
+          <w:cantSplit/>
+        </w:trPr>
+        <w:tc>
+          <w:tcPr>
+            <w:tcW w:type="dxa" w:w="624"/>
+            <w:tcMar>
+              <w:top w:w="80" w:type="dxa"/>
+              <w:bottom w:w="80" w:type="dxa"/>
+              <w:left w:w="100" w:type="dxa"/>
+              <w:right w:w="100" w:type="dxa"/>
+            </w:tcMar>
+          </w:tcPr>
+          <w:p>
+            <w:pPr>
+              <w:spacing w:before="40" w:after="40" w:line="276" w:lineRule="auto"/>
               <w:jc w:val="center"/>
             </w:pPr>
             <w:r>
@@ -2674,13 +2735,18 @@
         </w:tc>
         <w:tc>
           <w:tcPr>
-            <w:tcW w:type="dxa" w:w="2154"/>
-            <w:tcW w:w="2154" w:type="dxa"/>
-            <w:tcW w:w="2154" w:type="dxa"/>
-          </w:tcPr>
-          <w:p>
-            <w:pPr>
-              <w:jc w:val="both"/>
+            <w:tcW w:type="dxa" w:w="3175"/>
+            <w:tcMar>
+              <w:top w:w="80" w:type="dxa"/>
+              <w:bottom w:w="80" w:type="dxa"/>
+              <w:left w:w="100" w:type="dxa"/>
+              <w:right w:w="100" w:type="dxa"/>
+            </w:tcMar>
+          </w:tcPr>
+          <w:p>
+            <w:pPr>
+              <w:spacing w:before="40" w:after="40" w:line="276" w:lineRule="auto"/>
+              <w:jc w:val="left"/>
             </w:pPr>
             <w:r>
               <w:rPr>
@@ -2693,12 +2759,17 @@
         </w:tc>
         <w:tc>
           <w:tcPr>
-            <w:tcW w:type="dxa" w:w="624"/>
-            <w:tcW w:w="623" w:type="dxa"/>
-            <w:tcW w:w="623" w:type="dxa"/>
-          </w:tcPr>
-          <w:p>
-            <w:pPr>
+            <w:tcW w:type="dxa" w:w="907"/>
+            <w:tcMar>
+              <w:top w:w="80" w:type="dxa"/>
+              <w:bottom w:w="80" w:type="dxa"/>
+              <w:left w:w="100" w:type="dxa"/>
+              <w:right w:w="100" w:type="dxa"/>
+            </w:tcMar>
+          </w:tcPr>
+          <w:p>
+            <w:pPr>
+              <w:spacing w:before="40" w:after="40" w:line="276" w:lineRule="auto"/>
               <w:jc w:val="center"/>
             </w:pPr>
             <w:r>
@@ -2712,32 +2783,18 @@
         </w:tc>
         <w:tc>
           <w:tcPr>
-            <w:tcW w:type="dxa" w:w="794"/>
-            <w:tcW w:w="793" w:type="dxa"/>
-            <w:tcW w:w="793" w:type="dxa"/>
-          </w:tcPr>
-          <w:p>
-            <w:pPr>
-              <w:jc w:val="center"/>
-            </w:pPr>
-            <w:r>
-              <w:rPr>
-                <w:rFonts w:ascii="Times New Roman" w:hAnsi="Times New Roman"/>
-                <w:sz w:val="26"/>
-              </w:rPr>
-              <w:t>13</w:t>
-            </w:r>
-          </w:p>
-        </w:tc>
-        <w:tc>
-          <w:tcPr>
-            <w:tcW w:type="dxa" w:w="5272"/>
-            <w:tcW w:w="5273" w:type="dxa"/>
-            <w:tcW w:w="5273" w:type="dxa"/>
-          </w:tcPr>
-          <w:p>
-            <w:pPr>
-              <w:jc w:val="both"/>
+            <w:tcW w:type="dxa" w:w="4649"/>
+            <w:tcMar>
+              <w:top w:w="80" w:type="dxa"/>
+              <w:bottom w:w="80" w:type="dxa"/>
+              <w:left w:w="100" w:type="dxa"/>
+              <w:right w:w="100" w:type="dxa"/>
+            </w:tcMar>
+          </w:tcPr>
+          <w:p>
+            <w:pPr>
+              <w:spacing w:before="40" w:after="40" w:line="276" w:lineRule="auto"/>
+              <w:jc w:val="left"/>
             </w:pPr>
             <w:r>
               <w:rPr>
@@ -2750,14 +2807,22 @@
         </w:tc>
       </w:tr>
       <w:tr>
-        <w:tc>
-          <w:tcPr>
-            <w:tcW w:type="dxa" w:w="510"/>
-            <w:tcW w:w="510" w:type="dxa"/>
-            <w:tcW w:w="510" w:type="dxa"/>
-          </w:tcPr>
-          <w:p>
-            <w:pPr>
+        <w:trPr>
+          <w:cantSplit/>
+        </w:trPr>
+        <w:tc>
+          <w:tcPr>
+            <w:tcW w:type="dxa" w:w="624"/>
+            <w:tcMar>
+              <w:top w:w="80" w:type="dxa"/>
+              <w:bottom w:w="80" w:type="dxa"/>
+              <w:left w:w="100" w:type="dxa"/>
+              <w:right w:w="100" w:type="dxa"/>
+            </w:tcMar>
+          </w:tcPr>
+          <w:p>
+            <w:pPr>
+              <w:spacing w:before="40" w:after="40" w:line="276" w:lineRule="auto"/>
               <w:jc w:val="center"/>
             </w:pPr>
             <w:r>
@@ -2771,13 +2836,18 @@
         </w:tc>
         <w:tc>
           <w:tcPr>
-            <w:tcW w:type="dxa" w:w="2154"/>
-            <w:tcW w:w="2154" w:type="dxa"/>
-            <w:tcW w:w="2154" w:type="dxa"/>
-          </w:tcPr>
-          <w:p>
-            <w:pPr>
-              <w:jc w:val="both"/>
+            <w:tcW w:type="dxa" w:w="3175"/>
+            <w:tcMar>
+              <w:top w:w="80" w:type="dxa"/>
+              <w:bottom w:w="80" w:type="dxa"/>
+              <w:left w:w="100" w:type="dxa"/>
+              <w:right w:w="100" w:type="dxa"/>
+            </w:tcMar>
+          </w:tcPr>
+          <w:p>
+            <w:pPr>
+              <w:spacing w:before="40" w:after="40" w:line="276" w:lineRule="auto"/>
+              <w:jc w:val="left"/>
             </w:pPr>
             <w:r>
               <w:rPr>
@@ -2790,12 +2860,17 @@
         </w:tc>
         <w:tc>
           <w:tcPr>
-            <w:tcW w:type="dxa" w:w="624"/>
-            <w:tcW w:w="623" w:type="dxa"/>
-            <w:tcW w:w="623" w:type="dxa"/>
-          </w:tcPr>
-          <w:p>
-            <w:pPr>
+            <w:tcW w:type="dxa" w:w="907"/>
+            <w:tcMar>
+              <w:top w:w="80" w:type="dxa"/>
+              <w:bottom w:w="80" w:type="dxa"/>
+              <w:left w:w="100" w:type="dxa"/>
+              <w:right w:w="100" w:type="dxa"/>
+            </w:tcMar>
+          </w:tcPr>
+          <w:p>
+            <w:pPr>
+              <w:spacing w:before="40" w:after="40" w:line="276" w:lineRule="auto"/>
               <w:jc w:val="center"/>
             </w:pPr>
             <w:r>
@@ -2809,32 +2884,18 @@
         </w:tc>
         <w:tc>
           <w:tcPr>
-            <w:tcW w:type="dxa" w:w="794"/>
-            <w:tcW w:w="793" w:type="dxa"/>
-            <w:tcW w:w="793" w:type="dxa"/>
-          </w:tcPr>
-          <w:p>
-            <w:pPr>
-              <w:jc w:val="center"/>
-            </w:pPr>
-            <w:r>
-              <w:rPr>
-                <w:rFonts w:ascii="Times New Roman" w:hAnsi="Times New Roman"/>
-                <w:sz w:val="26"/>
-              </w:rPr>
-              <w:t>14</w:t>
-            </w:r>
-          </w:p>
-        </w:tc>
-        <w:tc>
-          <w:tcPr>
-            <w:tcW w:type="dxa" w:w="5272"/>
-            <w:tcW w:w="5273" w:type="dxa"/>
-            <w:tcW w:w="5273" w:type="dxa"/>
-          </w:tcPr>
-          <w:p>
-            <w:pPr>
-              <w:jc w:val="both"/>
+            <w:tcW w:type="dxa" w:w="4649"/>
+            <w:tcMar>
+              <w:top w:w="80" w:type="dxa"/>
+              <w:bottom w:w="80" w:type="dxa"/>
+              <w:left w:w="100" w:type="dxa"/>
+              <w:right w:w="100" w:type="dxa"/>
+            </w:tcMar>
+          </w:tcPr>
+          <w:p>
+            <w:pPr>
+              <w:spacing w:before="40" w:after="40" w:line="276" w:lineRule="auto"/>
+              <w:jc w:val="left"/>
             </w:pPr>
             <w:r>
               <w:rPr>
@@ -2847,14 +2908,22 @@
         </w:tc>
       </w:tr>
       <w:tr>
-        <w:tc>
-          <w:tcPr>
-            <w:tcW w:type="dxa" w:w="510"/>
-            <w:tcW w:w="510" w:type="dxa"/>
-            <w:tcW w:w="510" w:type="dxa"/>
-          </w:tcPr>
-          <w:p>
-            <w:pPr>
+        <w:trPr>
+          <w:cantSplit/>
+        </w:trPr>
+        <w:tc>
+          <w:tcPr>
+            <w:tcW w:type="dxa" w:w="624"/>
+            <w:tcMar>
+              <w:top w:w="80" w:type="dxa"/>
+              <w:bottom w:w="80" w:type="dxa"/>
+              <w:left w:w="100" w:type="dxa"/>
+              <w:right w:w="100" w:type="dxa"/>
+            </w:tcMar>
+          </w:tcPr>
+          <w:p>
+            <w:pPr>
+              <w:spacing w:before="40" w:after="40" w:line="276" w:lineRule="auto"/>
               <w:jc w:val="center"/>
             </w:pPr>
             <w:r>
@@ -2868,13 +2937,18 @@
         </w:tc>
         <w:tc>
           <w:tcPr>
-            <w:tcW w:type="dxa" w:w="2154"/>
-            <w:tcW w:w="2154" w:type="dxa"/>
-            <w:tcW w:w="2154" w:type="dxa"/>
-          </w:tcPr>
-          <w:p>
-            <w:pPr>
-              <w:jc w:val="both"/>
+            <w:tcW w:type="dxa" w:w="3175"/>
+            <w:tcMar>
+              <w:top w:w="80" w:type="dxa"/>
+              <w:bottom w:w="80" w:type="dxa"/>
+              <w:left w:w="100" w:type="dxa"/>
+              <w:right w:w="100" w:type="dxa"/>
+            </w:tcMar>
+          </w:tcPr>
+          <w:p>
+            <w:pPr>
+              <w:spacing w:before="40" w:after="40" w:line="276" w:lineRule="auto"/>
+              <w:jc w:val="left"/>
             </w:pPr>
             <w:r>
               <w:rPr>
@@ -2887,12 +2961,17 @@
         </w:tc>
         <w:tc>
           <w:tcPr>
-            <w:tcW w:type="dxa" w:w="624"/>
-            <w:tcW w:w="623" w:type="dxa"/>
-            <w:tcW w:w="623" w:type="dxa"/>
-          </w:tcPr>
-          <w:p>
-            <w:pPr>
+            <w:tcW w:type="dxa" w:w="907"/>
+            <w:tcMar>
+              <w:top w:w="80" w:type="dxa"/>
+              <w:bottom w:w="80" w:type="dxa"/>
+              <w:left w:w="100" w:type="dxa"/>
+              <w:right w:w="100" w:type="dxa"/>
+            </w:tcMar>
+          </w:tcPr>
+          <w:p>
+            <w:pPr>
+              <w:spacing w:before="40" w:after="40" w:line="276" w:lineRule="auto"/>
               <w:jc w:val="center"/>
             </w:pPr>
             <w:r>
@@ -2906,32 +2985,18 @@
         </w:tc>
         <w:tc>
           <w:tcPr>
-            <w:tcW w:type="dxa" w:w="794"/>
-            <w:tcW w:w="793" w:type="dxa"/>
-            <w:tcW w:w="793" w:type="dxa"/>
-          </w:tcPr>
-          <w:p>
-            <w:pPr>
-              <w:jc w:val="center"/>
-            </w:pPr>
-            <w:r>
-              <w:rPr>
-                <w:rFonts w:ascii="Times New Roman" w:hAnsi="Times New Roman"/>
-                <w:sz w:val="26"/>
-              </w:rPr>
-              <w:t>15</w:t>
-            </w:r>
-          </w:p>
-        </w:tc>
-        <w:tc>
-          <w:tcPr>
-            <w:tcW w:type="dxa" w:w="5272"/>
-            <w:tcW w:w="5273" w:type="dxa"/>
-            <w:tcW w:w="5273" w:type="dxa"/>
-          </w:tcPr>
-          <w:p>
-            <w:pPr>
-              <w:jc w:val="both"/>
+            <w:tcW w:type="dxa" w:w="4649"/>
+            <w:tcMar>
+              <w:top w:w="80" w:type="dxa"/>
+              <w:bottom w:w="80" w:type="dxa"/>
+              <w:left w:w="100" w:type="dxa"/>
+              <w:right w:w="100" w:type="dxa"/>
+            </w:tcMar>
+          </w:tcPr>
+          <w:p>
+            <w:pPr>
+              <w:spacing w:before="40" w:after="40" w:line="276" w:lineRule="auto"/>
+              <w:jc w:val="left"/>
             </w:pPr>
             <w:r>
               <w:rPr>
@@ -2944,14 +3009,22 @@
         </w:tc>
       </w:tr>
       <w:tr>
-        <w:tc>
-          <w:tcPr>
-            <w:tcW w:type="dxa" w:w="510"/>
-            <w:tcW w:w="510" w:type="dxa"/>
-            <w:tcW w:w="510" w:type="dxa"/>
-          </w:tcPr>
-          <w:p>
-            <w:pPr>
+        <w:trPr>
+          <w:cantSplit/>
+        </w:trPr>
+        <w:tc>
+          <w:tcPr>
+            <w:tcW w:type="dxa" w:w="624"/>
+            <w:tcMar>
+              <w:top w:w="80" w:type="dxa"/>
+              <w:bottom w:w="80" w:type="dxa"/>
+              <w:left w:w="100" w:type="dxa"/>
+              <w:right w:w="100" w:type="dxa"/>
+            </w:tcMar>
+          </w:tcPr>
+          <w:p>
+            <w:pPr>
+              <w:spacing w:before="40" w:after="40" w:line="276" w:lineRule="auto"/>
               <w:jc w:val="center"/>
             </w:pPr>
             <w:r>
@@ -2965,13 +3038,18 @@
         </w:tc>
         <w:tc>
           <w:tcPr>
-            <w:tcW w:type="dxa" w:w="2154"/>
-            <w:tcW w:w="2154" w:type="dxa"/>
-            <w:tcW w:w="2154" w:type="dxa"/>
-          </w:tcPr>
-          <w:p>
-            <w:pPr>
-              <w:jc w:val="both"/>
+            <w:tcW w:type="dxa" w:w="3175"/>
+            <w:tcMar>
+              <w:top w:w="80" w:type="dxa"/>
+              <w:bottom w:w="80" w:type="dxa"/>
+              <w:left w:w="100" w:type="dxa"/>
+              <w:right w:w="100" w:type="dxa"/>
+            </w:tcMar>
+          </w:tcPr>
+          <w:p>
+            <w:pPr>
+              <w:spacing w:before="40" w:after="40" w:line="276" w:lineRule="auto"/>
+              <w:jc w:val="left"/>
             </w:pPr>
             <w:r>
               <w:rPr>
@@ -2984,12 +3062,17 @@
         </w:tc>
         <w:tc>
           <w:tcPr>
-            <w:tcW w:type="dxa" w:w="624"/>
-            <w:tcW w:w="623" w:type="dxa"/>
-            <w:tcW w:w="623" w:type="dxa"/>
-          </w:tcPr>
-          <w:p>
-            <w:pPr>
+            <w:tcW w:type="dxa" w:w="907"/>
+            <w:tcMar>
+              <w:top w:w="80" w:type="dxa"/>
+              <w:bottom w:w="80" w:type="dxa"/>
+              <w:left w:w="100" w:type="dxa"/>
+              <w:right w:w="100" w:type="dxa"/>
+            </w:tcMar>
+          </w:tcPr>
+          <w:p>
+            <w:pPr>
+              <w:spacing w:before="40" w:after="40" w:line="276" w:lineRule="auto"/>
               <w:jc w:val="center"/>
             </w:pPr>
             <w:r>
@@ -3003,32 +3086,18 @@
         </w:tc>
         <w:tc>
           <w:tcPr>
-            <w:tcW w:type="dxa" w:w="794"/>
-            <w:tcW w:w="793" w:type="dxa"/>
-            <w:tcW w:w="793" w:type="dxa"/>
-          </w:tcPr>
-          <w:p>
-            <w:pPr>
-              <w:jc w:val="center"/>
-            </w:pPr>
-            <w:r>
-              <w:rPr>
-                <w:rFonts w:ascii="Times New Roman" w:hAnsi="Times New Roman"/>
-                <w:sz w:val="26"/>
-              </w:rPr>
-              <w:t>16</w:t>
-            </w:r>
-          </w:p>
-        </w:tc>
-        <w:tc>
-          <w:tcPr>
-            <w:tcW w:type="dxa" w:w="5272"/>
-            <w:tcW w:w="5273" w:type="dxa"/>
-            <w:tcW w:w="5273" w:type="dxa"/>
-          </w:tcPr>
-          <w:p>
-            <w:pPr>
-              <w:jc w:val="both"/>
+            <w:tcW w:type="dxa" w:w="4649"/>
+            <w:tcMar>
+              <w:top w:w="80" w:type="dxa"/>
+              <w:bottom w:w="80" w:type="dxa"/>
+              <w:left w:w="100" w:type="dxa"/>
+              <w:right w:w="100" w:type="dxa"/>
+            </w:tcMar>
+          </w:tcPr>
+          <w:p>
+            <w:pPr>
+              <w:spacing w:before="40" w:after="40" w:line="276" w:lineRule="auto"/>
+              <w:jc w:val="left"/>
             </w:pPr>
             <w:r>
               <w:rPr>
@@ -3041,14 +3110,22 @@
         </w:tc>
       </w:tr>
       <w:tr>
-        <w:tc>
-          <w:tcPr>
-            <w:tcW w:type="dxa" w:w="510"/>
-            <w:tcW w:w="510" w:type="dxa"/>
-            <w:tcW w:w="510" w:type="dxa"/>
-          </w:tcPr>
-          <w:p>
-            <w:pPr>
+        <w:trPr>
+          <w:cantSplit/>
+        </w:trPr>
+        <w:tc>
+          <w:tcPr>
+            <w:tcW w:type="dxa" w:w="624"/>
+            <w:tcMar>
+              <w:top w:w="80" w:type="dxa"/>
+              <w:bottom w:w="80" w:type="dxa"/>
+              <w:left w:w="100" w:type="dxa"/>
+              <w:right w:w="100" w:type="dxa"/>
+            </w:tcMar>
+          </w:tcPr>
+          <w:p>
+            <w:pPr>
+              <w:spacing w:before="40" w:after="40" w:line="276" w:lineRule="auto"/>
               <w:jc w:val="center"/>
             </w:pPr>
             <w:r>
@@ -3062,13 +3139,18 @@
         </w:tc>
         <w:tc>
           <w:tcPr>
-            <w:tcW w:type="dxa" w:w="2154"/>
-            <w:tcW w:w="2154" w:type="dxa"/>
-            <w:tcW w:w="2154" w:type="dxa"/>
-          </w:tcPr>
-          <w:p>
-            <w:pPr>
-              <w:jc w:val="both"/>
+            <w:tcW w:type="dxa" w:w="3175"/>
+            <w:tcMar>
+              <w:top w:w="80" w:type="dxa"/>
+              <w:bottom w:w="80" w:type="dxa"/>
+              <w:left w:w="100" w:type="dxa"/>
+              <w:right w:w="100" w:type="dxa"/>
+            </w:tcMar>
+          </w:tcPr>
+          <w:p>
+            <w:pPr>
+              <w:spacing w:before="40" w:after="40" w:line="276" w:lineRule="auto"/>
+              <w:jc w:val="left"/>
             </w:pPr>
             <w:r>
               <w:rPr>
@@ -3081,12 +3163,17 @@
         </w:tc>
         <w:tc>
           <w:tcPr>
-            <w:tcW w:type="dxa" w:w="624"/>
-            <w:tcW w:w="623" w:type="dxa"/>
-            <w:tcW w:w="623" w:type="dxa"/>
-          </w:tcPr>
-          <w:p>
-            <w:pPr>
+            <w:tcW w:type="dxa" w:w="907"/>
+            <w:tcMar>
+              <w:top w:w="80" w:type="dxa"/>
+              <w:bottom w:w="80" w:type="dxa"/>
+              <w:left w:w="100" w:type="dxa"/>
+              <w:right w:w="100" w:type="dxa"/>
+            </w:tcMar>
+          </w:tcPr>
+          <w:p>
+            <w:pPr>
+              <w:spacing w:before="40" w:after="40" w:line="276" w:lineRule="auto"/>
               <w:jc w:val="center"/>
             </w:pPr>
             <w:r>
@@ -3100,32 +3187,18 @@
         </w:tc>
         <w:tc>
           <w:tcPr>
-            <w:tcW w:type="dxa" w:w="794"/>
-            <w:tcW w:w="793" w:type="dxa"/>
-            <w:tcW w:w="793" w:type="dxa"/>
-          </w:tcPr>
-          <w:p>
-            <w:pPr>
-              <w:jc w:val="center"/>
-            </w:pPr>
-            <w:r>
-              <w:rPr>
-                <w:rFonts w:ascii="Times New Roman" w:hAnsi="Times New Roman"/>
-                <w:sz w:val="26"/>
-              </w:rPr>
-              <w:t>17</w:t>
-            </w:r>
-          </w:p>
-        </w:tc>
-        <w:tc>
-          <w:tcPr>
-            <w:tcW w:type="dxa" w:w="5272"/>
-            <w:tcW w:w="5273" w:type="dxa"/>
-            <w:tcW w:w="5273" w:type="dxa"/>
-          </w:tcPr>
-          <w:p>
-            <w:pPr>
-              <w:jc w:val="both"/>
+            <w:tcW w:type="dxa" w:w="4649"/>
+            <w:tcMar>
+              <w:top w:w="80" w:type="dxa"/>
+              <w:bottom w:w="80" w:type="dxa"/>
+              <w:left w:w="100" w:type="dxa"/>
+              <w:right w:w="100" w:type="dxa"/>
+            </w:tcMar>
+          </w:tcPr>
+          <w:p>
+            <w:pPr>
+              <w:spacing w:before="40" w:after="40" w:line="276" w:lineRule="auto"/>
+              <w:jc w:val="left"/>
             </w:pPr>
             <w:r>
               <w:rPr>
@@ -3138,14 +3211,22 @@
         </w:tc>
       </w:tr>
       <w:tr>
-        <w:tc>
-          <w:tcPr>
-            <w:tcW w:type="dxa" w:w="510"/>
-            <w:tcW w:w="510" w:type="dxa"/>
-            <w:tcW w:w="510" w:type="dxa"/>
-          </w:tcPr>
-          <w:p>
-            <w:pPr>
+        <w:trPr>
+          <w:cantSplit/>
+        </w:trPr>
+        <w:tc>
+          <w:tcPr>
+            <w:tcW w:type="dxa" w:w="624"/>
+            <w:tcMar>
+              <w:top w:w="80" w:type="dxa"/>
+              <w:bottom w:w="80" w:type="dxa"/>
+              <w:left w:w="100" w:type="dxa"/>
+              <w:right w:w="100" w:type="dxa"/>
+            </w:tcMar>
+          </w:tcPr>
+          <w:p>
+            <w:pPr>
+              <w:spacing w:before="40" w:after="40" w:line="276" w:lineRule="auto"/>
               <w:jc w:val="center"/>
             </w:pPr>
             <w:r>
@@ -3159,13 +3240,18 @@
         </w:tc>
         <w:tc>
           <w:tcPr>
-            <w:tcW w:type="dxa" w:w="2154"/>
-            <w:tcW w:w="2154" w:type="dxa"/>
-            <w:tcW w:w="2154" w:type="dxa"/>
-          </w:tcPr>
-          <w:p>
-            <w:pPr>
-              <w:jc w:val="both"/>
+            <w:tcW w:type="dxa" w:w="3175"/>
+            <w:tcMar>
+              <w:top w:w="80" w:type="dxa"/>
+              <w:bottom w:w="80" w:type="dxa"/>
+              <w:left w:w="100" w:type="dxa"/>
+              <w:right w:w="100" w:type="dxa"/>
+            </w:tcMar>
+          </w:tcPr>
+          <w:p>
+            <w:pPr>
+              <w:spacing w:before="40" w:after="40" w:line="276" w:lineRule="auto"/>
+              <w:jc w:val="left"/>
             </w:pPr>
             <w:r>
               <w:rPr>
@@ -3178,12 +3264,17 @@
         </w:tc>
         <w:tc>
           <w:tcPr>
-            <w:tcW w:type="dxa" w:w="624"/>
-            <w:tcW w:w="623" w:type="dxa"/>
-            <w:tcW w:w="623" w:type="dxa"/>
-          </w:tcPr>
-          <w:p>
-            <w:pPr>
+            <w:tcW w:type="dxa" w:w="907"/>
+            <w:tcMar>
+              <w:top w:w="80" w:type="dxa"/>
+              <w:bottom w:w="80" w:type="dxa"/>
+              <w:left w:w="100" w:type="dxa"/>
+              <w:right w:w="100" w:type="dxa"/>
+            </w:tcMar>
+          </w:tcPr>
+          <w:p>
+            <w:pPr>
+              <w:spacing w:before="40" w:after="40" w:line="276" w:lineRule="auto"/>
               <w:jc w:val="center"/>
             </w:pPr>
             <w:r>
@@ -3197,32 +3288,18 @@
         </w:tc>
         <w:tc>
           <w:tcPr>
-            <w:tcW w:type="dxa" w:w="794"/>
-            <w:tcW w:w="793" w:type="dxa"/>
-            <w:tcW w:w="793" w:type="dxa"/>
-          </w:tcPr>
-          <w:p>
-            <w:pPr>
-              <w:jc w:val="center"/>
-            </w:pPr>
-            <w:r>
-              <w:rPr>
-                <w:rFonts w:ascii="Times New Roman" w:hAnsi="Times New Roman"/>
-                <w:sz w:val="26"/>
-              </w:rPr>
-              <w:t>18</w:t>
-            </w:r>
-          </w:p>
-        </w:tc>
-        <w:tc>
-          <w:tcPr>
-            <w:tcW w:type="dxa" w:w="5272"/>
-            <w:tcW w:w="5273" w:type="dxa"/>
-            <w:tcW w:w="5273" w:type="dxa"/>
-          </w:tcPr>
-          <w:p>
-            <w:pPr>
-              <w:jc w:val="both"/>
+            <w:tcW w:type="dxa" w:w="4649"/>
+            <w:tcMar>
+              <w:top w:w="80" w:type="dxa"/>
+              <w:bottom w:w="80" w:type="dxa"/>
+              <w:left w:w="100" w:type="dxa"/>
+              <w:right w:w="100" w:type="dxa"/>
+            </w:tcMar>
+          </w:tcPr>
+          <w:p>
+            <w:pPr>
+              <w:spacing w:before="40" w:after="40" w:line="276" w:lineRule="auto"/>
+              <w:jc w:val="left"/>
             </w:pPr>
             <w:r>
               <w:rPr>
@@ -3235,14 +3312,22 @@
         </w:tc>
       </w:tr>
       <w:tr>
-        <w:tc>
-          <w:tcPr>
-            <w:tcW w:type="dxa" w:w="510"/>
-            <w:tcW w:w="510" w:type="dxa"/>
-            <w:tcW w:w="510" w:type="dxa"/>
-          </w:tcPr>
-          <w:p>
-            <w:pPr>
+        <w:trPr>
+          <w:cantSplit/>
+        </w:trPr>
+        <w:tc>
+          <w:tcPr>
+            <w:tcW w:type="dxa" w:w="624"/>
+            <w:tcMar>
+              <w:top w:w="80" w:type="dxa"/>
+              <w:bottom w:w="80" w:type="dxa"/>
+              <w:left w:w="100" w:type="dxa"/>
+              <w:right w:w="100" w:type="dxa"/>
+            </w:tcMar>
+          </w:tcPr>
+          <w:p>
+            <w:pPr>
+              <w:spacing w:before="40" w:after="40" w:line="276" w:lineRule="auto"/>
               <w:jc w:val="center"/>
             </w:pPr>
             <w:r>
@@ -3256,17 +3341,23 @@
         </w:tc>
         <w:tc>
           <w:tcPr>
-            <w:tcW w:type="dxa" w:w="2154"/>
-            <w:tcW w:w="2154" w:type="dxa"/>
-            <w:tcW w:w="2154" w:type="dxa"/>
-          </w:tcPr>
-          <w:p>
-            <w:pPr>
-              <w:jc w:val="both"/>
-            </w:pPr>
-            <w:r>
-              <w:rPr>
-                <w:rFonts w:ascii="Times New Roman" w:hAnsi="Times New Roman"/>
+            <w:tcW w:type="dxa" w:w="3175"/>
+            <w:tcMar>
+              <w:top w:w="80" w:type="dxa"/>
+              <w:bottom w:w="80" w:type="dxa"/>
+              <w:left w:w="100" w:type="dxa"/>
+              <w:right w:w="100" w:type="dxa"/>
+            </w:tcMar>
+          </w:tcPr>
+          <w:p>
+            <w:pPr>
+              <w:spacing w:before="40" w:after="40" w:line="276" w:lineRule="auto"/>
+              <w:jc w:val="left"/>
+            </w:pPr>
+            <w:r>
+              <w:rPr>
+                <w:rFonts w:ascii="Times New Roman" w:hAnsi="Times New Roman"/>
+                <w:b/>
                 <w:sz w:val="26"/>
               </w:rPr>
               <w:t>Ôn tập Coding cơ bản</w:t>
@@ -3275,12 +3366,17 @@
         </w:tc>
         <w:tc>
           <w:tcPr>
-            <w:tcW w:type="dxa" w:w="624"/>
-            <w:tcW w:w="623" w:type="dxa"/>
-            <w:tcW w:w="623" w:type="dxa"/>
-          </w:tcPr>
-          <w:p>
-            <w:pPr>
+            <w:tcW w:type="dxa" w:w="907"/>
+            <w:tcMar>
+              <w:top w:w="80" w:type="dxa"/>
+              <w:bottom w:w="80" w:type="dxa"/>
+              <w:left w:w="100" w:type="dxa"/>
+              <w:right w:w="100" w:type="dxa"/>
+            </w:tcMar>
+          </w:tcPr>
+          <w:p>
+            <w:pPr>
+              <w:spacing w:before="40" w:after="40" w:line="276" w:lineRule="auto"/>
               <w:jc w:val="center"/>
             </w:pPr>
             <w:r>
@@ -3294,32 +3390,18 @@
         </w:tc>
         <w:tc>
           <w:tcPr>
-            <w:tcW w:type="dxa" w:w="794"/>
-            <w:tcW w:w="793" w:type="dxa"/>
-            <w:tcW w:w="793" w:type="dxa"/>
-          </w:tcPr>
-          <w:p>
-            <w:pPr>
-              <w:jc w:val="center"/>
-            </w:pPr>
-            <w:r>
-              <w:rPr>
-                <w:rFonts w:ascii="Times New Roman" w:hAnsi="Times New Roman"/>
-                <w:sz w:val="26"/>
-              </w:rPr>
-              <w:t>19</w:t>
-            </w:r>
-          </w:p>
-        </w:tc>
-        <w:tc>
-          <w:tcPr>
-            <w:tcW w:type="dxa" w:w="5272"/>
-            <w:tcW w:w="5273" w:type="dxa"/>
-            <w:tcW w:w="5273" w:type="dxa"/>
-          </w:tcPr>
-          <w:p>
-            <w:pPr>
-              <w:jc w:val="both"/>
+            <w:tcW w:type="dxa" w:w="4649"/>
+            <w:tcMar>
+              <w:top w:w="80" w:type="dxa"/>
+              <w:bottom w:w="80" w:type="dxa"/>
+              <w:left w:w="100" w:type="dxa"/>
+              <w:right w:w="100" w:type="dxa"/>
+            </w:tcMar>
+          </w:tcPr>
+          <w:p>
+            <w:pPr>
+              <w:spacing w:before="40" w:after="40" w:line="276" w:lineRule="auto"/>
+              <w:jc w:val="left"/>
             </w:pPr>
             <w:r>
               <w:rPr>
@@ -3332,14 +3414,22 @@
         </w:tc>
       </w:tr>
       <w:tr>
-        <w:tc>
-          <w:tcPr>
-            <w:tcW w:type="dxa" w:w="510"/>
-            <w:tcW w:w="510" w:type="dxa"/>
-            <w:tcW w:w="510" w:type="dxa"/>
-          </w:tcPr>
-          <w:p>
-            <w:pPr>
+        <w:trPr>
+          <w:cantSplit/>
+        </w:trPr>
+        <w:tc>
+          <w:tcPr>
+            <w:tcW w:type="dxa" w:w="624"/>
+            <w:tcMar>
+              <w:top w:w="80" w:type="dxa"/>
+              <w:bottom w:w="80" w:type="dxa"/>
+              <w:left w:w="100" w:type="dxa"/>
+              <w:right w:w="100" w:type="dxa"/>
+            </w:tcMar>
+          </w:tcPr>
+          <w:p>
+            <w:pPr>
+              <w:spacing w:before="40" w:after="40" w:line="276" w:lineRule="auto"/>
               <w:jc w:val="center"/>
             </w:pPr>
             <w:r>
@@ -3353,17 +3443,23 @@
         </w:tc>
         <w:tc>
           <w:tcPr>
-            <w:tcW w:type="dxa" w:w="2154"/>
-            <w:tcW w:w="2154" w:type="dxa"/>
-            <w:tcW w:w="2154" w:type="dxa"/>
-          </w:tcPr>
-          <w:p>
-            <w:pPr>
-              <w:jc w:val="both"/>
-            </w:pPr>
-            <w:r>
-              <w:rPr>
-                <w:rFonts w:ascii="Times New Roman" w:hAnsi="Times New Roman"/>
+            <w:tcW w:type="dxa" w:w="3175"/>
+            <w:tcMar>
+              <w:top w:w="80" w:type="dxa"/>
+              <w:bottom w:w="80" w:type="dxa"/>
+              <w:left w:w="100" w:type="dxa"/>
+              <w:right w:w="100" w:type="dxa"/>
+            </w:tcMar>
+          </w:tcPr>
+          <w:p>
+            <w:pPr>
+              <w:spacing w:before="40" w:after="40" w:line="276" w:lineRule="auto"/>
+              <w:jc w:val="left"/>
+            </w:pPr>
+            <w:r>
+              <w:rPr>
+                <w:rFonts w:ascii="Times New Roman" w:hAnsi="Times New Roman"/>
+                <w:b/>
                 <w:sz w:val="26"/>
               </w:rPr>
               <w:t>ĐÁNH GIÁ ĐỊNH KỲ 2</w:t>
@@ -3372,12 +3468,17 @@
         </w:tc>
         <w:tc>
           <w:tcPr>
-            <w:tcW w:type="dxa" w:w="624"/>
-            <w:tcW w:w="623" w:type="dxa"/>
-            <w:tcW w:w="623" w:type="dxa"/>
-          </w:tcPr>
-          <w:p>
-            <w:pPr>
+            <w:tcW w:type="dxa" w:w="907"/>
+            <w:tcMar>
+              <w:top w:w="80" w:type="dxa"/>
+              <w:bottom w:w="80" w:type="dxa"/>
+              <w:left w:w="100" w:type="dxa"/>
+              <w:right w:w="100" w:type="dxa"/>
+            </w:tcMar>
+          </w:tcPr>
+          <w:p>
+            <w:pPr>
+              <w:spacing w:before="40" w:after="40" w:line="276" w:lineRule="auto"/>
               <w:jc w:val="center"/>
             </w:pPr>
             <w:r>
@@ -3391,32 +3492,18 @@
         </w:tc>
         <w:tc>
           <w:tcPr>
-            <w:tcW w:type="dxa" w:w="794"/>
-            <w:tcW w:w="793" w:type="dxa"/>
-            <w:tcW w:w="793" w:type="dxa"/>
-          </w:tcPr>
-          <w:p>
-            <w:pPr>
-              <w:jc w:val="center"/>
-            </w:pPr>
-            <w:r>
-              <w:rPr>
-                <w:rFonts w:ascii="Times New Roman" w:hAnsi="Times New Roman"/>
-                <w:sz w:val="26"/>
-              </w:rPr>
-              <w:t>20</w:t>
-            </w:r>
-          </w:p>
-        </w:tc>
-        <w:tc>
-          <w:tcPr>
-            <w:tcW w:type="dxa" w:w="5272"/>
-            <w:tcW w:w="5273" w:type="dxa"/>
-            <w:tcW w:w="5273" w:type="dxa"/>
-          </w:tcPr>
-          <w:p>
-            <w:pPr>
-              <w:jc w:val="both"/>
+            <w:tcW w:type="dxa" w:w="4649"/>
+            <w:tcMar>
+              <w:top w:w="80" w:type="dxa"/>
+              <w:bottom w:w="80" w:type="dxa"/>
+              <w:left w:w="100" w:type="dxa"/>
+              <w:right w:w="100" w:type="dxa"/>
+            </w:tcMar>
+          </w:tcPr>
+          <w:p>
+            <w:pPr>
+              <w:spacing w:before="40" w:after="40" w:line="276" w:lineRule="auto"/>
+              <w:jc w:val="left"/>
             </w:pPr>
             <w:r>
               <w:rPr>
@@ -3429,14 +3516,22 @@
         </w:tc>
       </w:tr>
       <w:tr>
-        <w:tc>
-          <w:tcPr>
-            <w:tcW w:type="dxa" w:w="510"/>
-            <w:tcW w:w="510" w:type="dxa"/>
-            <w:tcW w:w="510" w:type="dxa"/>
-          </w:tcPr>
-          <w:p>
-            <w:pPr>
+        <w:trPr>
+          <w:cantSplit/>
+        </w:trPr>
+        <w:tc>
+          <w:tcPr>
+            <w:tcW w:type="dxa" w:w="624"/>
+            <w:tcMar>
+              <w:top w:w="80" w:type="dxa"/>
+              <w:bottom w:w="80" w:type="dxa"/>
+              <w:left w:w="100" w:type="dxa"/>
+              <w:right w:w="100" w:type="dxa"/>
+            </w:tcMar>
+          </w:tcPr>
+          <w:p>
+            <w:pPr>
+              <w:spacing w:before="40" w:after="40" w:line="276" w:lineRule="auto"/>
               <w:jc w:val="center"/>
             </w:pPr>
             <w:r>
@@ -3450,13 +3545,18 @@
         </w:tc>
         <w:tc>
           <w:tcPr>
-            <w:tcW w:type="dxa" w:w="2154"/>
-            <w:tcW w:w="2154" w:type="dxa"/>
-            <w:tcW w:w="2154" w:type="dxa"/>
-          </w:tcPr>
-          <w:p>
-            <w:pPr>
-              <w:jc w:val="both"/>
+            <w:tcW w:type="dxa" w:w="3175"/>
+            <w:tcMar>
+              <w:top w:w="80" w:type="dxa"/>
+              <w:bottom w:w="80" w:type="dxa"/>
+              <w:left w:w="100" w:type="dxa"/>
+              <w:right w:w="100" w:type="dxa"/>
+            </w:tcMar>
+          </w:tcPr>
+          <w:p>
+            <w:pPr>
+              <w:spacing w:before="40" w:after="40" w:line="276" w:lineRule="auto"/>
+              <w:jc w:val="left"/>
             </w:pPr>
             <w:r>
               <w:rPr>
@@ -3469,12 +3569,17 @@
         </w:tc>
         <w:tc>
           <w:tcPr>
-            <w:tcW w:type="dxa" w:w="624"/>
-            <w:tcW w:w="623" w:type="dxa"/>
-            <w:tcW w:w="623" w:type="dxa"/>
-          </w:tcPr>
-          <w:p>
-            <w:pPr>
+            <w:tcW w:type="dxa" w:w="907"/>
+            <w:tcMar>
+              <w:top w:w="80" w:type="dxa"/>
+              <w:bottom w:w="80" w:type="dxa"/>
+              <w:left w:w="100" w:type="dxa"/>
+              <w:right w:w="100" w:type="dxa"/>
+            </w:tcMar>
+          </w:tcPr>
+          <w:p>
+            <w:pPr>
+              <w:spacing w:before="40" w:after="40" w:line="276" w:lineRule="auto"/>
               <w:jc w:val="center"/>
             </w:pPr>
             <w:r>
@@ -3488,32 +3593,18 @@
         </w:tc>
         <w:tc>
           <w:tcPr>
-            <w:tcW w:type="dxa" w:w="794"/>
-            <w:tcW w:w="793" w:type="dxa"/>
-            <w:tcW w:w="793" w:type="dxa"/>
-          </w:tcPr>
-          <w:p>
-            <w:pPr>
-              <w:jc w:val="center"/>
-            </w:pPr>
-            <w:r>
-              <w:rPr>
-                <w:rFonts w:ascii="Times New Roman" w:hAnsi="Times New Roman"/>
-                <w:sz w:val="26"/>
-              </w:rPr>
-              <w:t>21</w:t>
-            </w:r>
-          </w:p>
-        </w:tc>
-        <w:tc>
-          <w:tcPr>
-            <w:tcW w:type="dxa" w:w="5272"/>
-            <w:tcW w:w="5273" w:type="dxa"/>
-            <w:tcW w:w="5273" w:type="dxa"/>
-          </w:tcPr>
-          <w:p>
-            <w:pPr>
-              <w:jc w:val="both"/>
+            <w:tcW w:type="dxa" w:w="4649"/>
+            <w:tcMar>
+              <w:top w:w="80" w:type="dxa"/>
+              <w:bottom w:w="80" w:type="dxa"/>
+              <w:left w:w="100" w:type="dxa"/>
+              <w:right w:w="100" w:type="dxa"/>
+            </w:tcMar>
+          </w:tcPr>
+          <w:p>
+            <w:pPr>
+              <w:spacing w:before="40" w:after="40" w:line="276" w:lineRule="auto"/>
+              <w:jc w:val="left"/>
             </w:pPr>
             <w:r>
               <w:rPr>
@@ -3526,14 +3617,22 @@
         </w:tc>
       </w:tr>
       <w:tr>
-        <w:tc>
-          <w:tcPr>
-            <w:tcW w:type="dxa" w:w="510"/>
-            <w:tcW w:w="510" w:type="dxa"/>
-            <w:tcW w:w="510" w:type="dxa"/>
-          </w:tcPr>
-          <w:p>
-            <w:pPr>
+        <w:trPr>
+          <w:cantSplit/>
+        </w:trPr>
+        <w:tc>
+          <w:tcPr>
+            <w:tcW w:type="dxa" w:w="624"/>
+            <w:tcMar>
+              <w:top w:w="80" w:type="dxa"/>
+              <w:bottom w:w="80" w:type="dxa"/>
+              <w:left w:w="100" w:type="dxa"/>
+              <w:right w:w="100" w:type="dxa"/>
+            </w:tcMar>
+          </w:tcPr>
+          <w:p>
+            <w:pPr>
+              <w:spacing w:before="40" w:after="40" w:line="276" w:lineRule="auto"/>
               <w:jc w:val="center"/>
             </w:pPr>
             <w:r>
@@ -3547,13 +3646,18 @@
         </w:tc>
         <w:tc>
           <w:tcPr>
-            <w:tcW w:type="dxa" w:w="2154"/>
-            <w:tcW w:w="2154" w:type="dxa"/>
-            <w:tcW w:w="2154" w:type="dxa"/>
-          </w:tcPr>
-          <w:p>
-            <w:pPr>
-              <w:jc w:val="both"/>
+            <w:tcW w:type="dxa" w:w="3175"/>
+            <w:tcMar>
+              <w:top w:w="80" w:type="dxa"/>
+              <w:bottom w:w="80" w:type="dxa"/>
+              <w:left w:w="100" w:type="dxa"/>
+              <w:right w:w="100" w:type="dxa"/>
+            </w:tcMar>
+          </w:tcPr>
+          <w:p>
+            <w:pPr>
+              <w:spacing w:before="40" w:after="40" w:line="276" w:lineRule="auto"/>
+              <w:jc w:val="left"/>
             </w:pPr>
             <w:r>
               <w:rPr>
@@ -3566,12 +3670,17 @@
         </w:tc>
         <w:tc>
           <w:tcPr>
-            <w:tcW w:type="dxa" w:w="624"/>
-            <w:tcW w:w="623" w:type="dxa"/>
-            <w:tcW w:w="623" w:type="dxa"/>
-          </w:tcPr>
-          <w:p>
-            <w:pPr>
+            <w:tcW w:type="dxa" w:w="907"/>
+            <w:tcMar>
+              <w:top w:w="80" w:type="dxa"/>
+              <w:bottom w:w="80" w:type="dxa"/>
+              <w:left w:w="100" w:type="dxa"/>
+              <w:right w:w="100" w:type="dxa"/>
+            </w:tcMar>
+          </w:tcPr>
+          <w:p>
+            <w:pPr>
+              <w:spacing w:before="40" w:after="40" w:line="276" w:lineRule="auto"/>
               <w:jc w:val="center"/>
             </w:pPr>
             <w:r>
@@ -3585,32 +3694,18 @@
         </w:tc>
         <w:tc>
           <w:tcPr>
-            <w:tcW w:type="dxa" w:w="794"/>
-            <w:tcW w:w="793" w:type="dxa"/>
-            <w:tcW w:w="793" w:type="dxa"/>
-          </w:tcPr>
-          <w:p>
-            <w:pPr>
-              <w:jc w:val="center"/>
-            </w:pPr>
-            <w:r>
-              <w:rPr>
-                <w:rFonts w:ascii="Times New Roman" w:hAnsi="Times New Roman"/>
-                <w:sz w:val="26"/>
-              </w:rPr>
-              <w:t>22</w:t>
-            </w:r>
-          </w:p>
-        </w:tc>
-        <w:tc>
-          <w:tcPr>
-            <w:tcW w:type="dxa" w:w="5272"/>
-            <w:tcW w:w="5273" w:type="dxa"/>
-            <w:tcW w:w="5273" w:type="dxa"/>
-          </w:tcPr>
-          <w:p>
-            <w:pPr>
-              <w:jc w:val="both"/>
+            <w:tcW w:type="dxa" w:w="4649"/>
+            <w:tcMar>
+              <w:top w:w="80" w:type="dxa"/>
+              <w:bottom w:w="80" w:type="dxa"/>
+              <w:left w:w="100" w:type="dxa"/>
+              <w:right w:w="100" w:type="dxa"/>
+            </w:tcMar>
+          </w:tcPr>
+          <w:p>
+            <w:pPr>
+              <w:spacing w:before="40" w:after="40" w:line="276" w:lineRule="auto"/>
+              <w:jc w:val="left"/>
             </w:pPr>
             <w:r>
               <w:rPr>
@@ -3623,14 +3718,22 @@
         </w:tc>
       </w:tr>
       <w:tr>
-        <w:tc>
-          <w:tcPr>
-            <w:tcW w:type="dxa" w:w="510"/>
-            <w:tcW w:w="510" w:type="dxa"/>
-            <w:tcW w:w="510" w:type="dxa"/>
-          </w:tcPr>
-          <w:p>
-            <w:pPr>
+        <w:trPr>
+          <w:cantSplit/>
+        </w:trPr>
+        <w:tc>
+          <w:tcPr>
+            <w:tcW w:type="dxa" w:w="624"/>
+            <w:tcMar>
+              <w:top w:w="80" w:type="dxa"/>
+              <w:bottom w:w="80" w:type="dxa"/>
+              <w:left w:w="100" w:type="dxa"/>
+              <w:right w:w="100" w:type="dxa"/>
+            </w:tcMar>
+          </w:tcPr>
+          <w:p>
+            <w:pPr>
+              <w:spacing w:before="40" w:after="40" w:line="276" w:lineRule="auto"/>
               <w:jc w:val="center"/>
             </w:pPr>
             <w:r>
@@ -3644,13 +3747,18 @@
         </w:tc>
         <w:tc>
           <w:tcPr>
-            <w:tcW w:type="dxa" w:w="2154"/>
-            <w:tcW w:w="2154" w:type="dxa"/>
-            <w:tcW w:w="2154" w:type="dxa"/>
-          </w:tcPr>
-          <w:p>
-            <w:pPr>
-              <w:jc w:val="both"/>
+            <w:tcW w:type="dxa" w:w="3175"/>
+            <w:tcMar>
+              <w:top w:w="80" w:type="dxa"/>
+              <w:bottom w:w="80" w:type="dxa"/>
+              <w:left w:w="100" w:type="dxa"/>
+              <w:right w:w="100" w:type="dxa"/>
+            </w:tcMar>
+          </w:tcPr>
+          <w:p>
+            <w:pPr>
+              <w:spacing w:before="40" w:after="40" w:line="276" w:lineRule="auto"/>
+              <w:jc w:val="left"/>
             </w:pPr>
             <w:r>
               <w:rPr>
@@ -3663,12 +3771,17 @@
         </w:tc>
         <w:tc>
           <w:tcPr>
-            <w:tcW w:type="dxa" w:w="624"/>
-            <w:tcW w:w="623" w:type="dxa"/>
-            <w:tcW w:w="623" w:type="dxa"/>
-          </w:tcPr>
-          <w:p>
-            <w:pPr>
+            <w:tcW w:type="dxa" w:w="907"/>
+            <w:tcMar>
+              <w:top w:w="80" w:type="dxa"/>
+              <w:bottom w:w="80" w:type="dxa"/>
+              <w:left w:w="100" w:type="dxa"/>
+              <w:right w:w="100" w:type="dxa"/>
+            </w:tcMar>
+          </w:tcPr>
+          <w:p>
+            <w:pPr>
+              <w:spacing w:before="40" w:after="40" w:line="276" w:lineRule="auto"/>
               <w:jc w:val="center"/>
             </w:pPr>
             <w:r>
@@ -3682,32 +3795,18 @@
         </w:tc>
         <w:tc>
           <w:tcPr>
-            <w:tcW w:type="dxa" w:w="794"/>
-            <w:tcW w:w="793" w:type="dxa"/>
-            <w:tcW w:w="793" w:type="dxa"/>
-          </w:tcPr>
-          <w:p>
-            <w:pPr>
-              <w:jc w:val="center"/>
-            </w:pPr>
-            <w:r>
-              <w:rPr>
-                <w:rFonts w:ascii="Times New Roman" w:hAnsi="Times New Roman"/>
-                <w:sz w:val="26"/>
-              </w:rPr>
-              <w:t>23</w:t>
-            </w:r>
-          </w:p>
-        </w:tc>
-        <w:tc>
-          <w:tcPr>
-            <w:tcW w:type="dxa" w:w="5272"/>
-            <w:tcW w:w="5273" w:type="dxa"/>
-            <w:tcW w:w="5273" w:type="dxa"/>
-          </w:tcPr>
-          <w:p>
-            <w:pPr>
-              <w:jc w:val="both"/>
+            <w:tcW w:type="dxa" w:w="4649"/>
+            <w:tcMar>
+              <w:top w:w="80" w:type="dxa"/>
+              <w:bottom w:w="80" w:type="dxa"/>
+              <w:left w:w="100" w:type="dxa"/>
+              <w:right w:w="100" w:type="dxa"/>
+            </w:tcMar>
+          </w:tcPr>
+          <w:p>
+            <w:pPr>
+              <w:spacing w:before="40" w:after="40" w:line="276" w:lineRule="auto"/>
+              <w:jc w:val="left"/>
             </w:pPr>
             <w:r>
               <w:rPr>
@@ -3720,14 +3819,22 @@
         </w:tc>
       </w:tr>
       <w:tr>
-        <w:tc>
-          <w:tcPr>
-            <w:tcW w:type="dxa" w:w="510"/>
-            <w:tcW w:w="510" w:type="dxa"/>
-            <w:tcW w:w="510" w:type="dxa"/>
-          </w:tcPr>
-          <w:p>
-            <w:pPr>
+        <w:trPr>
+          <w:cantSplit/>
+        </w:trPr>
+        <w:tc>
+          <w:tcPr>
+            <w:tcW w:type="dxa" w:w="624"/>
+            <w:tcMar>
+              <w:top w:w="80" w:type="dxa"/>
+              <w:bottom w:w="80" w:type="dxa"/>
+              <w:left w:w="100" w:type="dxa"/>
+              <w:right w:w="100" w:type="dxa"/>
+            </w:tcMar>
+          </w:tcPr>
+          <w:p>
+            <w:pPr>
+              <w:spacing w:before="40" w:after="40" w:line="276" w:lineRule="auto"/>
               <w:jc w:val="center"/>
             </w:pPr>
             <w:r>
@@ -3741,13 +3848,18 @@
         </w:tc>
         <w:tc>
           <w:tcPr>
-            <w:tcW w:type="dxa" w:w="2154"/>
-            <w:tcW w:w="2154" w:type="dxa"/>
-            <w:tcW w:w="2154" w:type="dxa"/>
-          </w:tcPr>
-          <w:p>
-            <w:pPr>
-              <w:jc w:val="both"/>
+            <w:tcW w:type="dxa" w:w="3175"/>
+            <w:tcMar>
+              <w:top w:w="80" w:type="dxa"/>
+              <w:bottom w:w="80" w:type="dxa"/>
+              <w:left w:w="100" w:type="dxa"/>
+              <w:right w:w="100" w:type="dxa"/>
+            </w:tcMar>
+          </w:tcPr>
+          <w:p>
+            <w:pPr>
+              <w:spacing w:before="40" w:after="40" w:line="276" w:lineRule="auto"/>
+              <w:jc w:val="left"/>
             </w:pPr>
             <w:r>
               <w:rPr>
@@ -3760,12 +3872,17 @@
         </w:tc>
         <w:tc>
           <w:tcPr>
-            <w:tcW w:type="dxa" w:w="624"/>
-            <w:tcW w:w="623" w:type="dxa"/>
-            <w:tcW w:w="623" w:type="dxa"/>
-          </w:tcPr>
-          <w:p>
-            <w:pPr>
+            <w:tcW w:type="dxa" w:w="907"/>
+            <w:tcMar>
+              <w:top w:w="80" w:type="dxa"/>
+              <w:bottom w:w="80" w:type="dxa"/>
+              <w:left w:w="100" w:type="dxa"/>
+              <w:right w:w="100" w:type="dxa"/>
+            </w:tcMar>
+          </w:tcPr>
+          <w:p>
+            <w:pPr>
+              <w:spacing w:before="40" w:after="40" w:line="276" w:lineRule="auto"/>
               <w:jc w:val="center"/>
             </w:pPr>
             <w:r>
@@ -3779,32 +3896,18 @@
         </w:tc>
         <w:tc>
           <w:tcPr>
-            <w:tcW w:type="dxa" w:w="794"/>
-            <w:tcW w:w="793" w:type="dxa"/>
-            <w:tcW w:w="793" w:type="dxa"/>
-          </w:tcPr>
-          <w:p>
-            <w:pPr>
-              <w:jc w:val="center"/>
-            </w:pPr>
-            <w:r>
-              <w:rPr>
-                <w:rFonts w:ascii="Times New Roman" w:hAnsi="Times New Roman"/>
-                <w:sz w:val="26"/>
-              </w:rPr>
-              <w:t>24</w:t>
-            </w:r>
-          </w:p>
-        </w:tc>
-        <w:tc>
-          <w:tcPr>
-            <w:tcW w:type="dxa" w:w="5272"/>
-            <w:tcW w:w="5273" w:type="dxa"/>
-            <w:tcW w:w="5273" w:type="dxa"/>
-          </w:tcPr>
-          <w:p>
-            <w:pPr>
-              <w:jc w:val="both"/>
+            <w:tcW w:type="dxa" w:w="4649"/>
+            <w:tcMar>
+              <w:top w:w="80" w:type="dxa"/>
+              <w:bottom w:w="80" w:type="dxa"/>
+              <w:left w:w="100" w:type="dxa"/>
+              <w:right w:w="100" w:type="dxa"/>
+            </w:tcMar>
+          </w:tcPr>
+          <w:p>
+            <w:pPr>
+              <w:spacing w:before="40" w:after="40" w:line="276" w:lineRule="auto"/>
+              <w:jc w:val="left"/>
             </w:pPr>
             <w:r>
               <w:rPr>
@@ -3817,14 +3920,22 @@
         </w:tc>
       </w:tr>
       <w:tr>
-        <w:tc>
-          <w:tcPr>
-            <w:tcW w:type="dxa" w:w="510"/>
-            <w:tcW w:w="510" w:type="dxa"/>
-            <w:tcW w:w="510" w:type="dxa"/>
-          </w:tcPr>
-          <w:p>
-            <w:pPr>
+        <w:trPr>
+          <w:cantSplit/>
+        </w:trPr>
+        <w:tc>
+          <w:tcPr>
+            <w:tcW w:type="dxa" w:w="624"/>
+            <w:tcMar>
+              <w:top w:w="80" w:type="dxa"/>
+              <w:bottom w:w="80" w:type="dxa"/>
+              <w:left w:w="100" w:type="dxa"/>
+              <w:right w:w="100" w:type="dxa"/>
+            </w:tcMar>
+          </w:tcPr>
+          <w:p>
+            <w:pPr>
+              <w:spacing w:before="40" w:after="40" w:line="276" w:lineRule="auto"/>
               <w:jc w:val="center"/>
             </w:pPr>
             <w:r>
@@ -3838,13 +3949,18 @@
         </w:tc>
         <w:tc>
           <w:tcPr>
-            <w:tcW w:type="dxa" w:w="2154"/>
-            <w:tcW w:w="2154" w:type="dxa"/>
-            <w:tcW w:w="2154" w:type="dxa"/>
-          </w:tcPr>
-          <w:p>
-            <w:pPr>
-              <w:jc w:val="both"/>
+            <w:tcW w:type="dxa" w:w="3175"/>
+            <w:tcMar>
+              <w:top w:w="80" w:type="dxa"/>
+              <w:bottom w:w="80" w:type="dxa"/>
+              <w:left w:w="100" w:type="dxa"/>
+              <w:right w:w="100" w:type="dxa"/>
+            </w:tcMar>
+          </w:tcPr>
+          <w:p>
+            <w:pPr>
+              <w:spacing w:before="40" w:after="40" w:line="276" w:lineRule="auto"/>
+              <w:jc w:val="left"/>
             </w:pPr>
             <w:r>
               <w:rPr>
@@ -3857,12 +3973,17 @@
         </w:tc>
         <w:tc>
           <w:tcPr>
-            <w:tcW w:type="dxa" w:w="624"/>
-            <w:tcW w:w="623" w:type="dxa"/>
-            <w:tcW w:w="623" w:type="dxa"/>
-          </w:tcPr>
-          <w:p>
-            <w:pPr>
+            <w:tcW w:type="dxa" w:w="907"/>
+            <w:tcMar>
+              <w:top w:w="80" w:type="dxa"/>
+              <w:bottom w:w="80" w:type="dxa"/>
+              <w:left w:w="100" w:type="dxa"/>
+              <w:right w:w="100" w:type="dxa"/>
+            </w:tcMar>
+          </w:tcPr>
+          <w:p>
+            <w:pPr>
+              <w:spacing w:before="40" w:after="40" w:line="276" w:lineRule="auto"/>
               <w:jc w:val="center"/>
             </w:pPr>
             <w:r>
@@ -3876,32 +3997,18 @@
         </w:tc>
         <w:tc>
           <w:tcPr>
-            <w:tcW w:type="dxa" w:w="794"/>
-            <w:tcW w:w="793" w:type="dxa"/>
-            <w:tcW w:w="793" w:type="dxa"/>
-          </w:tcPr>
-          <w:p>
-            <w:pPr>
-              <w:jc w:val="center"/>
-            </w:pPr>
-            <w:r>
-              <w:rPr>
-                <w:rFonts w:ascii="Times New Roman" w:hAnsi="Times New Roman"/>
-                <w:sz w:val="26"/>
-              </w:rPr>
-              <w:t>25</w:t>
-            </w:r>
-          </w:p>
-        </w:tc>
-        <w:tc>
-          <w:tcPr>
-            <w:tcW w:type="dxa" w:w="5272"/>
-            <w:tcW w:w="5273" w:type="dxa"/>
-            <w:tcW w:w="5273" w:type="dxa"/>
-          </w:tcPr>
-          <w:p>
-            <w:pPr>
-              <w:jc w:val="both"/>
+            <w:tcW w:type="dxa" w:w="4649"/>
+            <w:tcMar>
+              <w:top w:w="80" w:type="dxa"/>
+              <w:bottom w:w="80" w:type="dxa"/>
+              <w:left w:w="100" w:type="dxa"/>
+              <w:right w:w="100" w:type="dxa"/>
+            </w:tcMar>
+          </w:tcPr>
+          <w:p>
+            <w:pPr>
+              <w:spacing w:before="40" w:after="40" w:line="276" w:lineRule="auto"/>
+              <w:jc w:val="left"/>
             </w:pPr>
             <w:r>
               <w:rPr>
@@ -3914,14 +4021,22 @@
         </w:tc>
       </w:tr>
       <w:tr>
-        <w:tc>
-          <w:tcPr>
-            <w:tcW w:type="dxa" w:w="510"/>
-            <w:tcW w:w="510" w:type="dxa"/>
-            <w:tcW w:w="510" w:type="dxa"/>
-          </w:tcPr>
-          <w:p>
-            <w:pPr>
+        <w:trPr>
+          <w:cantSplit/>
+        </w:trPr>
+        <w:tc>
+          <w:tcPr>
+            <w:tcW w:type="dxa" w:w="624"/>
+            <w:tcMar>
+              <w:top w:w="80" w:type="dxa"/>
+              <w:bottom w:w="80" w:type="dxa"/>
+              <w:left w:w="100" w:type="dxa"/>
+              <w:right w:w="100" w:type="dxa"/>
+            </w:tcMar>
+          </w:tcPr>
+          <w:p>
+            <w:pPr>
+              <w:spacing w:before="40" w:after="40" w:line="276" w:lineRule="auto"/>
               <w:jc w:val="center"/>
             </w:pPr>
             <w:r>
@@ -3935,13 +4050,18 @@
         </w:tc>
         <w:tc>
           <w:tcPr>
-            <w:tcW w:type="dxa" w:w="2154"/>
-            <w:tcW w:w="2154" w:type="dxa"/>
-            <w:tcW w:w="2154" w:type="dxa"/>
-          </w:tcPr>
-          <w:p>
-            <w:pPr>
-              <w:jc w:val="both"/>
+            <w:tcW w:type="dxa" w:w="3175"/>
+            <w:tcMar>
+              <w:top w:w="80" w:type="dxa"/>
+              <w:bottom w:w="80" w:type="dxa"/>
+              <w:left w:w="100" w:type="dxa"/>
+              <w:right w:w="100" w:type="dxa"/>
+            </w:tcMar>
+          </w:tcPr>
+          <w:p>
+            <w:pPr>
+              <w:spacing w:before="40" w:after="40" w:line="276" w:lineRule="auto"/>
+              <w:jc w:val="left"/>
             </w:pPr>
             <w:r>
               <w:rPr>
@@ -3954,12 +4074,17 @@
         </w:tc>
         <w:tc>
           <w:tcPr>
-            <w:tcW w:type="dxa" w:w="624"/>
-            <w:tcW w:w="623" w:type="dxa"/>
-            <w:tcW w:w="623" w:type="dxa"/>
-          </w:tcPr>
-          <w:p>
-            <w:pPr>
+            <w:tcW w:type="dxa" w:w="907"/>
+            <w:tcMar>
+              <w:top w:w="80" w:type="dxa"/>
+              <w:bottom w:w="80" w:type="dxa"/>
+              <w:left w:w="100" w:type="dxa"/>
+              <w:right w:w="100" w:type="dxa"/>
+            </w:tcMar>
+          </w:tcPr>
+          <w:p>
+            <w:pPr>
+              <w:spacing w:before="40" w:after="40" w:line="276" w:lineRule="auto"/>
               <w:jc w:val="center"/>
             </w:pPr>
             <w:r>
@@ -3973,32 +4098,18 @@
         </w:tc>
         <w:tc>
           <w:tcPr>
-            <w:tcW w:type="dxa" w:w="794"/>
-            <w:tcW w:w="793" w:type="dxa"/>
-            <w:tcW w:w="793" w:type="dxa"/>
-          </w:tcPr>
-          <w:p>
-            <w:pPr>
-              <w:jc w:val="center"/>
-            </w:pPr>
-            <w:r>
-              <w:rPr>
-                <w:rFonts w:ascii="Times New Roman" w:hAnsi="Times New Roman"/>
-                <w:sz w:val="26"/>
-              </w:rPr>
-              <w:t>26</w:t>
-            </w:r>
-          </w:p>
-        </w:tc>
-        <w:tc>
-          <w:tcPr>
-            <w:tcW w:type="dxa" w:w="5272"/>
-            <w:tcW w:w="5273" w:type="dxa"/>
-            <w:tcW w:w="5273" w:type="dxa"/>
-          </w:tcPr>
-          <w:p>
-            <w:pPr>
-              <w:jc w:val="both"/>
+            <w:tcW w:type="dxa" w:w="4649"/>
+            <w:tcMar>
+              <w:top w:w="80" w:type="dxa"/>
+              <w:bottom w:w="80" w:type="dxa"/>
+              <w:left w:w="100" w:type="dxa"/>
+              <w:right w:w="100" w:type="dxa"/>
+            </w:tcMar>
+          </w:tcPr>
+          <w:p>
+            <w:pPr>
+              <w:spacing w:before="40" w:after="40" w:line="276" w:lineRule="auto"/>
+              <w:jc w:val="left"/>
             </w:pPr>
             <w:r>
               <w:rPr>
@@ -4011,14 +4122,22 @@
         </w:tc>
       </w:tr>
       <w:tr>
-        <w:tc>
-          <w:tcPr>
-            <w:tcW w:type="dxa" w:w="510"/>
-            <w:tcW w:w="510" w:type="dxa"/>
-            <w:tcW w:w="510" w:type="dxa"/>
-          </w:tcPr>
-          <w:p>
-            <w:pPr>
+        <w:trPr>
+          <w:cantSplit/>
+        </w:trPr>
+        <w:tc>
+          <w:tcPr>
+            <w:tcW w:type="dxa" w:w="624"/>
+            <w:tcMar>
+              <w:top w:w="80" w:type="dxa"/>
+              <w:bottom w:w="80" w:type="dxa"/>
+              <w:left w:w="100" w:type="dxa"/>
+              <w:right w:w="100" w:type="dxa"/>
+            </w:tcMar>
+          </w:tcPr>
+          <w:p>
+            <w:pPr>
+              <w:spacing w:before="40" w:after="40" w:line="276" w:lineRule="auto"/>
               <w:jc w:val="center"/>
             </w:pPr>
             <w:r>
@@ -4032,13 +4151,18 @@
         </w:tc>
         <w:tc>
           <w:tcPr>
-            <w:tcW w:type="dxa" w:w="2154"/>
-            <w:tcW w:w="2154" w:type="dxa"/>
-            <w:tcW w:w="2154" w:type="dxa"/>
-          </w:tcPr>
-          <w:p>
-            <w:pPr>
-              <w:jc w:val="both"/>
+            <w:tcW w:type="dxa" w:w="3175"/>
+            <w:tcMar>
+              <w:top w:w="80" w:type="dxa"/>
+              <w:bottom w:w="80" w:type="dxa"/>
+              <w:left w:w="100" w:type="dxa"/>
+              <w:right w:w="100" w:type="dxa"/>
+            </w:tcMar>
+          </w:tcPr>
+          <w:p>
+            <w:pPr>
+              <w:spacing w:before="40" w:after="40" w:line="276" w:lineRule="auto"/>
+              <w:jc w:val="left"/>
             </w:pPr>
             <w:r>
               <w:rPr>
@@ -4051,12 +4175,17 @@
         </w:tc>
         <w:tc>
           <w:tcPr>
-            <w:tcW w:type="dxa" w:w="624"/>
-            <w:tcW w:w="623" w:type="dxa"/>
-            <w:tcW w:w="623" w:type="dxa"/>
-          </w:tcPr>
-          <w:p>
-            <w:pPr>
+            <w:tcW w:type="dxa" w:w="907"/>
+            <w:tcMar>
+              <w:top w:w="80" w:type="dxa"/>
+              <w:bottom w:w="80" w:type="dxa"/>
+              <w:left w:w="100" w:type="dxa"/>
+              <w:right w:w="100" w:type="dxa"/>
+            </w:tcMar>
+          </w:tcPr>
+          <w:p>
+            <w:pPr>
+              <w:spacing w:before="40" w:after="40" w:line="276" w:lineRule="auto"/>
               <w:jc w:val="center"/>
             </w:pPr>
             <w:r>
@@ -4070,32 +4199,18 @@
         </w:tc>
         <w:tc>
           <w:tcPr>
-            <w:tcW w:type="dxa" w:w="794"/>
-            <w:tcW w:w="793" w:type="dxa"/>
-            <w:tcW w:w="793" w:type="dxa"/>
-          </w:tcPr>
-          <w:p>
-            <w:pPr>
-              <w:jc w:val="center"/>
-            </w:pPr>
-            <w:r>
-              <w:rPr>
-                <w:rFonts w:ascii="Times New Roman" w:hAnsi="Times New Roman"/>
-                <w:sz w:val="26"/>
-              </w:rPr>
-              <w:t>27</w:t>
-            </w:r>
-          </w:p>
-        </w:tc>
-        <w:tc>
-          <w:tcPr>
-            <w:tcW w:type="dxa" w:w="5272"/>
-            <w:tcW w:w="5273" w:type="dxa"/>
-            <w:tcW w:w="5273" w:type="dxa"/>
-          </w:tcPr>
-          <w:p>
-            <w:pPr>
-              <w:jc w:val="both"/>
+            <w:tcW w:type="dxa" w:w="4649"/>
+            <w:tcMar>
+              <w:top w:w="80" w:type="dxa"/>
+              <w:bottom w:w="80" w:type="dxa"/>
+              <w:left w:w="100" w:type="dxa"/>
+              <w:right w:w="100" w:type="dxa"/>
+            </w:tcMar>
+          </w:tcPr>
+          <w:p>
+            <w:pPr>
+              <w:spacing w:before="40" w:after="40" w:line="276" w:lineRule="auto"/>
+              <w:jc w:val="left"/>
             </w:pPr>
             <w:r>
               <w:rPr>
@@ -4108,14 +4223,22 @@
         </w:tc>
       </w:tr>
       <w:tr>
-        <w:tc>
-          <w:tcPr>
-            <w:tcW w:type="dxa" w:w="510"/>
-            <w:tcW w:w="510" w:type="dxa"/>
-            <w:tcW w:w="510" w:type="dxa"/>
-          </w:tcPr>
-          <w:p>
-            <w:pPr>
+        <w:trPr>
+          <w:cantSplit/>
+        </w:trPr>
+        <w:tc>
+          <w:tcPr>
+            <w:tcW w:type="dxa" w:w="624"/>
+            <w:tcMar>
+              <w:top w:w="80" w:type="dxa"/>
+              <w:bottom w:w="80" w:type="dxa"/>
+              <w:left w:w="100" w:type="dxa"/>
+              <w:right w:w="100" w:type="dxa"/>
+            </w:tcMar>
+          </w:tcPr>
+          <w:p>
+            <w:pPr>
+              <w:spacing w:before="40" w:after="40" w:line="276" w:lineRule="auto"/>
               <w:jc w:val="center"/>
             </w:pPr>
             <w:r>
@@ -4129,13 +4252,18 @@
         </w:tc>
         <w:tc>
           <w:tcPr>
-            <w:tcW w:type="dxa" w:w="2154"/>
-            <w:tcW w:w="2154" w:type="dxa"/>
-            <w:tcW w:w="2154" w:type="dxa"/>
-          </w:tcPr>
-          <w:p>
-            <w:pPr>
-              <w:jc w:val="both"/>
+            <w:tcW w:type="dxa" w:w="3175"/>
+            <w:tcMar>
+              <w:top w:w="80" w:type="dxa"/>
+              <w:bottom w:w="80" w:type="dxa"/>
+              <w:left w:w="100" w:type="dxa"/>
+              <w:right w:w="100" w:type="dxa"/>
+            </w:tcMar>
+          </w:tcPr>
+          <w:p>
+            <w:pPr>
+              <w:spacing w:before="40" w:after="40" w:line="276" w:lineRule="auto"/>
+              <w:jc w:val="left"/>
             </w:pPr>
             <w:r>
               <w:rPr>
@@ -4148,12 +4276,17 @@
         </w:tc>
         <w:tc>
           <w:tcPr>
-            <w:tcW w:type="dxa" w:w="624"/>
-            <w:tcW w:w="623" w:type="dxa"/>
-            <w:tcW w:w="623" w:type="dxa"/>
-          </w:tcPr>
-          <w:p>
-            <w:pPr>
+            <w:tcW w:type="dxa" w:w="907"/>
+            <w:tcMar>
+              <w:top w:w="80" w:type="dxa"/>
+              <w:bottom w:w="80" w:type="dxa"/>
+              <w:left w:w="100" w:type="dxa"/>
+              <w:right w:w="100" w:type="dxa"/>
+            </w:tcMar>
+          </w:tcPr>
+          <w:p>
+            <w:pPr>
+              <w:spacing w:before="40" w:after="40" w:line="276" w:lineRule="auto"/>
               <w:jc w:val="center"/>
             </w:pPr>
             <w:r>
@@ -4167,32 +4300,18 @@
         </w:tc>
         <w:tc>
           <w:tcPr>
-            <w:tcW w:type="dxa" w:w="794"/>
-            <w:tcW w:w="793" w:type="dxa"/>
-            <w:tcW w:w="793" w:type="dxa"/>
-          </w:tcPr>
-          <w:p>
-            <w:pPr>
-              <w:jc w:val="center"/>
-            </w:pPr>
-            <w:r>
-              <w:rPr>
-                <w:rFonts w:ascii="Times New Roman" w:hAnsi="Times New Roman"/>
-                <w:sz w:val="26"/>
-              </w:rPr>
-              <w:t>28</w:t>
-            </w:r>
-          </w:p>
-        </w:tc>
-        <w:tc>
-          <w:tcPr>
-            <w:tcW w:type="dxa" w:w="5272"/>
-            <w:tcW w:w="5273" w:type="dxa"/>
-            <w:tcW w:w="5273" w:type="dxa"/>
-          </w:tcPr>
-          <w:p>
-            <w:pPr>
-              <w:jc w:val="both"/>
+            <w:tcW w:type="dxa" w:w="4649"/>
+            <w:tcMar>
+              <w:top w:w="80" w:type="dxa"/>
+              <w:bottom w:w="80" w:type="dxa"/>
+              <w:left w:w="100" w:type="dxa"/>
+              <w:right w:w="100" w:type="dxa"/>
+            </w:tcMar>
+          </w:tcPr>
+          <w:p>
+            <w:pPr>
+              <w:spacing w:before="40" w:after="40" w:line="276" w:lineRule="auto"/>
+              <w:jc w:val="left"/>
             </w:pPr>
             <w:r>
               <w:rPr>
@@ -4205,14 +4324,22 @@
         </w:tc>
       </w:tr>
       <w:tr>
-        <w:tc>
-          <w:tcPr>
-            <w:tcW w:type="dxa" w:w="510"/>
-            <w:tcW w:w="510" w:type="dxa"/>
-            <w:tcW w:w="510" w:type="dxa"/>
-          </w:tcPr>
-          <w:p>
-            <w:pPr>
+        <w:trPr>
+          <w:cantSplit/>
+        </w:trPr>
+        <w:tc>
+          <w:tcPr>
+            <w:tcW w:type="dxa" w:w="624"/>
+            <w:tcMar>
+              <w:top w:w="80" w:type="dxa"/>
+              <w:bottom w:w="80" w:type="dxa"/>
+              <w:left w:w="100" w:type="dxa"/>
+              <w:right w:w="100" w:type="dxa"/>
+            </w:tcMar>
+          </w:tcPr>
+          <w:p>
+            <w:pPr>
+              <w:spacing w:before="40" w:after="40" w:line="276" w:lineRule="auto"/>
               <w:jc w:val="center"/>
             </w:pPr>
             <w:r>
@@ -4226,17 +4353,23 @@
         </w:tc>
         <w:tc>
           <w:tcPr>
-            <w:tcW w:type="dxa" w:w="2154"/>
-            <w:tcW w:w="2154" w:type="dxa"/>
-            <w:tcW w:w="2154" w:type="dxa"/>
-          </w:tcPr>
-          <w:p>
-            <w:pPr>
-              <w:jc w:val="both"/>
-            </w:pPr>
-            <w:r>
-              <w:rPr>
-                <w:rFonts w:ascii="Times New Roman" w:hAnsi="Times New Roman"/>
+            <w:tcW w:type="dxa" w:w="3175"/>
+            <w:tcMar>
+              <w:top w:w="80" w:type="dxa"/>
+              <w:bottom w:w="80" w:type="dxa"/>
+              <w:left w:w="100" w:type="dxa"/>
+              <w:right w:w="100" w:type="dxa"/>
+            </w:tcMar>
+          </w:tcPr>
+          <w:p>
+            <w:pPr>
+              <w:spacing w:before="40" w:after="40" w:line="276" w:lineRule="auto"/>
+              <w:jc w:val="left"/>
+            </w:pPr>
+            <w:r>
+              <w:rPr>
+                <w:rFonts w:ascii="Times New Roman" w:hAnsi="Times New Roman"/>
+                <w:b/>
                 <w:sz w:val="26"/>
               </w:rPr>
               <w:t>ĐÁNH GIÁ ĐỊNH KỲ 3</w:t>
@@ -4245,12 +4378,17 @@
         </w:tc>
         <w:tc>
           <w:tcPr>
-            <w:tcW w:type="dxa" w:w="624"/>
-            <w:tcW w:w="623" w:type="dxa"/>
-            <w:tcW w:w="623" w:type="dxa"/>
-          </w:tcPr>
-          <w:p>
-            <w:pPr>
+            <w:tcW w:type="dxa" w:w="907"/>
+            <w:tcMar>
+              <w:top w:w="80" w:type="dxa"/>
+              <w:bottom w:w="80" w:type="dxa"/>
+              <w:left w:w="100" w:type="dxa"/>
+              <w:right w:w="100" w:type="dxa"/>
+            </w:tcMar>
+          </w:tcPr>
+          <w:p>
+            <w:pPr>
+              <w:spacing w:before="40" w:after="40" w:line="276" w:lineRule="auto"/>
               <w:jc w:val="center"/>
             </w:pPr>
             <w:r>
@@ -4264,32 +4402,18 @@
         </w:tc>
         <w:tc>
           <w:tcPr>
-            <w:tcW w:type="dxa" w:w="794"/>
-            <w:tcW w:w="793" w:type="dxa"/>
-            <w:tcW w:w="793" w:type="dxa"/>
-          </w:tcPr>
-          <w:p>
-            <w:pPr>
-              <w:jc w:val="center"/>
-            </w:pPr>
-            <w:r>
-              <w:rPr>
-                <w:rFonts w:ascii="Times New Roman" w:hAnsi="Times New Roman"/>
-                <w:sz w:val="26"/>
-              </w:rPr>
-              <w:t>29</w:t>
-            </w:r>
-          </w:p>
-        </w:tc>
-        <w:tc>
-          <w:tcPr>
-            <w:tcW w:type="dxa" w:w="5272"/>
-            <w:tcW w:w="5273" w:type="dxa"/>
-            <w:tcW w:w="5273" w:type="dxa"/>
-          </w:tcPr>
-          <w:p>
-            <w:pPr>
-              <w:jc w:val="both"/>
+            <w:tcW w:type="dxa" w:w="4649"/>
+            <w:tcMar>
+              <w:top w:w="80" w:type="dxa"/>
+              <w:bottom w:w="80" w:type="dxa"/>
+              <w:left w:w="100" w:type="dxa"/>
+              <w:right w:w="100" w:type="dxa"/>
+            </w:tcMar>
+          </w:tcPr>
+          <w:p>
+            <w:pPr>
+              <w:spacing w:before="40" w:after="40" w:line="276" w:lineRule="auto"/>
+              <w:jc w:val="left"/>
             </w:pPr>
             <w:r>
               <w:rPr>
@@ -4302,14 +4426,22 @@
         </w:tc>
       </w:tr>
       <w:tr>
-        <w:tc>
-          <w:tcPr>
-            <w:tcW w:type="dxa" w:w="510"/>
-            <w:tcW w:w="510" w:type="dxa"/>
-            <w:tcW w:w="510" w:type="dxa"/>
-          </w:tcPr>
-          <w:p>
-            <w:pPr>
+        <w:trPr>
+          <w:cantSplit/>
+        </w:trPr>
+        <w:tc>
+          <w:tcPr>
+            <w:tcW w:type="dxa" w:w="624"/>
+            <w:tcMar>
+              <w:top w:w="80" w:type="dxa"/>
+              <w:bottom w:w="80" w:type="dxa"/>
+              <w:left w:w="100" w:type="dxa"/>
+              <w:right w:w="100" w:type="dxa"/>
+            </w:tcMar>
+          </w:tcPr>
+          <w:p>
+            <w:pPr>
+              <w:spacing w:before="40" w:after="40" w:line="276" w:lineRule="auto"/>
               <w:jc w:val="center"/>
             </w:pPr>
             <w:r>
@@ -4323,13 +4455,18 @@
         </w:tc>
         <w:tc>
           <w:tcPr>
-            <w:tcW w:type="dxa" w:w="2154"/>
-            <w:tcW w:w="2154" w:type="dxa"/>
-            <w:tcW w:w="2154" w:type="dxa"/>
-          </w:tcPr>
-          <w:p>
-            <w:pPr>
-              <w:jc w:val="both"/>
+            <w:tcW w:type="dxa" w:w="3175"/>
+            <w:tcMar>
+              <w:top w:w="80" w:type="dxa"/>
+              <w:bottom w:w="80" w:type="dxa"/>
+              <w:left w:w="100" w:type="dxa"/>
+              <w:right w:w="100" w:type="dxa"/>
+            </w:tcMar>
+          </w:tcPr>
+          <w:p>
+            <w:pPr>
+              <w:spacing w:before="40" w:after="40" w:line="276" w:lineRule="auto"/>
+              <w:jc w:val="left"/>
             </w:pPr>
             <w:r>
               <w:rPr>
@@ -4342,12 +4479,17 @@
         </w:tc>
         <w:tc>
           <w:tcPr>
-            <w:tcW w:type="dxa" w:w="624"/>
-            <w:tcW w:w="623" w:type="dxa"/>
-            <w:tcW w:w="623" w:type="dxa"/>
-          </w:tcPr>
-          <w:p>
-            <w:pPr>
+            <w:tcW w:type="dxa" w:w="907"/>
+            <w:tcMar>
+              <w:top w:w="80" w:type="dxa"/>
+              <w:bottom w:w="80" w:type="dxa"/>
+              <w:left w:w="100" w:type="dxa"/>
+              <w:right w:w="100" w:type="dxa"/>
+            </w:tcMar>
+          </w:tcPr>
+          <w:p>
+            <w:pPr>
+              <w:spacing w:before="40" w:after="40" w:line="276" w:lineRule="auto"/>
               <w:jc w:val="center"/>
             </w:pPr>
             <w:r>
@@ -4361,32 +4503,18 @@
         </w:tc>
         <w:tc>
           <w:tcPr>
-            <w:tcW w:type="dxa" w:w="794"/>
-            <w:tcW w:w="793" w:type="dxa"/>
-            <w:tcW w:w="793" w:type="dxa"/>
-          </w:tcPr>
-          <w:p>
-            <w:pPr>
-              <w:jc w:val="center"/>
-            </w:pPr>
-            <w:r>
-              <w:rPr>
-                <w:rFonts w:ascii="Times New Roman" w:hAnsi="Times New Roman"/>
-                <w:sz w:val="26"/>
-              </w:rPr>
-              <w:t>30</w:t>
-            </w:r>
-          </w:p>
-        </w:tc>
-        <w:tc>
-          <w:tcPr>
-            <w:tcW w:type="dxa" w:w="5272"/>
-            <w:tcW w:w="5273" w:type="dxa"/>
-            <w:tcW w:w="5273" w:type="dxa"/>
-          </w:tcPr>
-          <w:p>
-            <w:pPr>
-              <w:jc w:val="both"/>
+            <w:tcW w:type="dxa" w:w="4649"/>
+            <w:tcMar>
+              <w:top w:w="80" w:type="dxa"/>
+              <w:bottom w:w="80" w:type="dxa"/>
+              <w:left w:w="100" w:type="dxa"/>
+              <w:right w:w="100" w:type="dxa"/>
+            </w:tcMar>
+          </w:tcPr>
+          <w:p>
+            <w:pPr>
+              <w:spacing w:before="40" w:after="40" w:line="276" w:lineRule="auto"/>
+              <w:jc w:val="left"/>
             </w:pPr>
             <w:r>
               <w:rPr>
@@ -4399,14 +4527,22 @@
         </w:tc>
       </w:tr>
       <w:tr>
-        <w:tc>
-          <w:tcPr>
-            <w:tcW w:type="dxa" w:w="510"/>
-            <w:tcW w:w="510" w:type="dxa"/>
-            <w:tcW w:w="510" w:type="dxa"/>
-          </w:tcPr>
-          <w:p>
-            <w:pPr>
+        <w:trPr>
+          <w:cantSplit/>
+        </w:trPr>
+        <w:tc>
+          <w:tcPr>
+            <w:tcW w:type="dxa" w:w="624"/>
+            <w:tcMar>
+              <w:top w:w="80" w:type="dxa"/>
+              <w:bottom w:w="80" w:type="dxa"/>
+              <w:left w:w="100" w:type="dxa"/>
+              <w:right w:w="100" w:type="dxa"/>
+            </w:tcMar>
+          </w:tcPr>
+          <w:p>
+            <w:pPr>
+              <w:spacing w:before="40" w:after="40" w:line="276" w:lineRule="auto"/>
               <w:jc w:val="center"/>
             </w:pPr>
             <w:r>
@@ -4420,13 +4556,18 @@
         </w:tc>
         <w:tc>
           <w:tcPr>
-            <w:tcW w:type="dxa" w:w="2154"/>
-            <w:tcW w:w="2154" w:type="dxa"/>
-            <w:tcW w:w="2154" w:type="dxa"/>
-          </w:tcPr>
-          <w:p>
-            <w:pPr>
-              <w:jc w:val="both"/>
+            <w:tcW w:type="dxa" w:w="3175"/>
+            <w:tcMar>
+              <w:top w:w="80" w:type="dxa"/>
+              <w:bottom w:w="80" w:type="dxa"/>
+              <w:left w:w="100" w:type="dxa"/>
+              <w:right w:w="100" w:type="dxa"/>
+            </w:tcMar>
+          </w:tcPr>
+          <w:p>
+            <w:pPr>
+              <w:spacing w:before="40" w:after="40" w:line="276" w:lineRule="auto"/>
+              <w:jc w:val="left"/>
             </w:pPr>
             <w:r>
               <w:rPr>
@@ -4439,12 +4580,17 @@
         </w:tc>
         <w:tc>
           <w:tcPr>
-            <w:tcW w:type="dxa" w:w="624"/>
-            <w:tcW w:w="623" w:type="dxa"/>
-            <w:tcW w:w="623" w:type="dxa"/>
-          </w:tcPr>
-          <w:p>
-            <w:pPr>
+            <w:tcW w:type="dxa" w:w="907"/>
+            <w:tcMar>
+              <w:top w:w="80" w:type="dxa"/>
+              <w:bottom w:w="80" w:type="dxa"/>
+              <w:left w:w="100" w:type="dxa"/>
+              <w:right w:w="100" w:type="dxa"/>
+            </w:tcMar>
+          </w:tcPr>
+          <w:p>
+            <w:pPr>
+              <w:spacing w:before="40" w:after="40" w:line="276" w:lineRule="auto"/>
               <w:jc w:val="center"/>
             </w:pPr>
             <w:r>
@@ -4458,32 +4604,18 @@
         </w:tc>
         <w:tc>
           <w:tcPr>
-            <w:tcW w:type="dxa" w:w="794"/>
-            <w:tcW w:w="793" w:type="dxa"/>
-            <w:tcW w:w="793" w:type="dxa"/>
-          </w:tcPr>
-          <w:p>
-            <w:pPr>
-              <w:jc w:val="center"/>
-            </w:pPr>
-            <w:r>
-              <w:rPr>
-                <w:rFonts w:ascii="Times New Roman" w:hAnsi="Times New Roman"/>
-                <w:sz w:val="26"/>
-              </w:rPr>
-              <w:t>31</w:t>
-            </w:r>
-          </w:p>
-        </w:tc>
-        <w:tc>
-          <w:tcPr>
-            <w:tcW w:type="dxa" w:w="5272"/>
-            <w:tcW w:w="5273" w:type="dxa"/>
-            <w:tcW w:w="5273" w:type="dxa"/>
-          </w:tcPr>
-          <w:p>
-            <w:pPr>
-              <w:jc w:val="both"/>
+            <w:tcW w:type="dxa" w:w="4649"/>
+            <w:tcMar>
+              <w:top w:w="80" w:type="dxa"/>
+              <w:bottom w:w="80" w:type="dxa"/>
+              <w:left w:w="100" w:type="dxa"/>
+              <w:right w:w="100" w:type="dxa"/>
+            </w:tcMar>
+          </w:tcPr>
+          <w:p>
+            <w:pPr>
+              <w:spacing w:before="40" w:after="40" w:line="276" w:lineRule="auto"/>
+              <w:jc w:val="left"/>
             </w:pPr>
             <w:r>
               <w:rPr>
@@ -4496,14 +4628,22 @@
         </w:tc>
       </w:tr>
       <w:tr>
-        <w:tc>
-          <w:tcPr>
-            <w:tcW w:type="dxa" w:w="510"/>
-            <w:tcW w:w="510" w:type="dxa"/>
-            <w:tcW w:w="510" w:type="dxa"/>
-          </w:tcPr>
-          <w:p>
-            <w:pPr>
+        <w:trPr>
+          <w:cantSplit/>
+        </w:trPr>
+        <w:tc>
+          <w:tcPr>
+            <w:tcW w:type="dxa" w:w="624"/>
+            <w:tcMar>
+              <w:top w:w="80" w:type="dxa"/>
+              <w:bottom w:w="80" w:type="dxa"/>
+              <w:left w:w="100" w:type="dxa"/>
+              <w:right w:w="100" w:type="dxa"/>
+            </w:tcMar>
+          </w:tcPr>
+          <w:p>
+            <w:pPr>
+              <w:spacing w:before="40" w:after="40" w:line="276" w:lineRule="auto"/>
               <w:jc w:val="center"/>
             </w:pPr>
             <w:r>
@@ -4517,13 +4657,18 @@
         </w:tc>
         <w:tc>
           <w:tcPr>
-            <w:tcW w:type="dxa" w:w="2154"/>
-            <w:tcW w:w="2154" w:type="dxa"/>
-            <w:tcW w:w="2154" w:type="dxa"/>
-          </w:tcPr>
-          <w:p>
-            <w:pPr>
-              <w:jc w:val="both"/>
+            <w:tcW w:type="dxa" w:w="3175"/>
+            <w:tcMar>
+              <w:top w:w="80" w:type="dxa"/>
+              <w:bottom w:w="80" w:type="dxa"/>
+              <w:left w:w="100" w:type="dxa"/>
+              <w:right w:w="100" w:type="dxa"/>
+            </w:tcMar>
+          </w:tcPr>
+          <w:p>
+            <w:pPr>
+              <w:spacing w:before="40" w:after="40" w:line="276" w:lineRule="auto"/>
+              <w:jc w:val="left"/>
             </w:pPr>
             <w:r>
               <w:rPr>
@@ -4536,12 +4681,17 @@
         </w:tc>
         <w:tc>
           <w:tcPr>
-            <w:tcW w:type="dxa" w:w="624"/>
-            <w:tcW w:w="623" w:type="dxa"/>
-            <w:tcW w:w="623" w:type="dxa"/>
-          </w:tcPr>
-          <w:p>
-            <w:pPr>
+            <w:tcW w:type="dxa" w:w="907"/>
+            <w:tcMar>
+              <w:top w:w="80" w:type="dxa"/>
+              <w:bottom w:w="80" w:type="dxa"/>
+              <w:left w:w="100" w:type="dxa"/>
+              <w:right w:w="100" w:type="dxa"/>
+            </w:tcMar>
+          </w:tcPr>
+          <w:p>
+            <w:pPr>
+              <w:spacing w:before="40" w:after="40" w:line="276" w:lineRule="auto"/>
               <w:jc w:val="center"/>
             </w:pPr>
             <w:r>
@@ -4555,32 +4705,18 @@
         </w:tc>
         <w:tc>
           <w:tcPr>
-            <w:tcW w:type="dxa" w:w="794"/>
-            <w:tcW w:w="793" w:type="dxa"/>
-            <w:tcW w:w="793" w:type="dxa"/>
-          </w:tcPr>
-          <w:p>
-            <w:pPr>
-              <w:jc w:val="center"/>
-            </w:pPr>
-            <w:r>
-              <w:rPr>
-                <w:rFonts w:ascii="Times New Roman" w:hAnsi="Times New Roman"/>
-                <w:sz w:val="26"/>
-              </w:rPr>
-              <w:t>32</w:t>
-            </w:r>
-          </w:p>
-        </w:tc>
-        <w:tc>
-          <w:tcPr>
-            <w:tcW w:type="dxa" w:w="5272"/>
-            <w:tcW w:w="5273" w:type="dxa"/>
-            <w:tcW w:w="5273" w:type="dxa"/>
-          </w:tcPr>
-          <w:p>
-            <w:pPr>
-              <w:jc w:val="both"/>
+            <w:tcW w:type="dxa" w:w="4649"/>
+            <w:tcMar>
+              <w:top w:w="80" w:type="dxa"/>
+              <w:bottom w:w="80" w:type="dxa"/>
+              <w:left w:w="100" w:type="dxa"/>
+              <w:right w:w="100" w:type="dxa"/>
+            </w:tcMar>
+          </w:tcPr>
+          <w:p>
+            <w:pPr>
+              <w:spacing w:before="40" w:after="40" w:line="276" w:lineRule="auto"/>
+              <w:jc w:val="left"/>
             </w:pPr>
             <w:r>
               <w:rPr>
@@ -4593,14 +4729,22 @@
         </w:tc>
       </w:tr>
       <w:tr>
-        <w:tc>
-          <w:tcPr>
-            <w:tcW w:type="dxa" w:w="510"/>
-            <w:tcW w:w="510" w:type="dxa"/>
-            <w:tcW w:w="510" w:type="dxa"/>
-          </w:tcPr>
-          <w:p>
-            <w:pPr>
+        <w:trPr>
+          <w:cantSplit/>
+        </w:trPr>
+        <w:tc>
+          <w:tcPr>
+            <w:tcW w:type="dxa" w:w="624"/>
+            <w:tcMar>
+              <w:top w:w="80" w:type="dxa"/>
+              <w:bottom w:w="80" w:type="dxa"/>
+              <w:left w:w="100" w:type="dxa"/>
+              <w:right w:w="100" w:type="dxa"/>
+            </w:tcMar>
+          </w:tcPr>
+          <w:p>
+            <w:pPr>
+              <w:spacing w:before="40" w:after="40" w:line="276" w:lineRule="auto"/>
               <w:jc w:val="center"/>
             </w:pPr>
             <w:r>
@@ -4614,13 +4758,18 @@
         </w:tc>
         <w:tc>
           <w:tcPr>
-            <w:tcW w:type="dxa" w:w="2154"/>
-            <w:tcW w:w="2154" w:type="dxa"/>
-            <w:tcW w:w="2154" w:type="dxa"/>
-          </w:tcPr>
-          <w:p>
-            <w:pPr>
-              <w:jc w:val="both"/>
+            <w:tcW w:type="dxa" w:w="3175"/>
+            <w:tcMar>
+              <w:top w:w="80" w:type="dxa"/>
+              <w:bottom w:w="80" w:type="dxa"/>
+              <w:left w:w="100" w:type="dxa"/>
+              <w:right w:w="100" w:type="dxa"/>
+            </w:tcMar>
+          </w:tcPr>
+          <w:p>
+            <w:pPr>
+              <w:spacing w:before="40" w:after="40" w:line="276" w:lineRule="auto"/>
+              <w:jc w:val="left"/>
             </w:pPr>
             <w:r>
               <w:rPr>
@@ -4633,12 +4782,17 @@
         </w:tc>
         <w:tc>
           <w:tcPr>
-            <w:tcW w:type="dxa" w:w="624"/>
-            <w:tcW w:w="623" w:type="dxa"/>
-            <w:tcW w:w="623" w:type="dxa"/>
-          </w:tcPr>
-          <w:p>
-            <w:pPr>
+            <w:tcW w:type="dxa" w:w="907"/>
+            <w:tcMar>
+              <w:top w:w="80" w:type="dxa"/>
+              <w:bottom w:w="80" w:type="dxa"/>
+              <w:left w:w="100" w:type="dxa"/>
+              <w:right w:w="100" w:type="dxa"/>
+            </w:tcMar>
+          </w:tcPr>
+          <w:p>
+            <w:pPr>
+              <w:spacing w:before="40" w:after="40" w:line="276" w:lineRule="auto"/>
               <w:jc w:val="center"/>
             </w:pPr>
             <w:r>
@@ -4652,32 +4806,18 @@
         </w:tc>
         <w:tc>
           <w:tcPr>
-            <w:tcW w:type="dxa" w:w="794"/>
-            <w:tcW w:w="793" w:type="dxa"/>
-            <w:tcW w:w="793" w:type="dxa"/>
-          </w:tcPr>
-          <w:p>
-            <w:pPr>
-              <w:jc w:val="center"/>
-            </w:pPr>
-            <w:r>
-              <w:rPr>
-                <w:rFonts w:ascii="Times New Roman" w:hAnsi="Times New Roman"/>
-                <w:sz w:val="26"/>
-              </w:rPr>
-              <w:t>33</w:t>
-            </w:r>
-          </w:p>
-        </w:tc>
-        <w:tc>
-          <w:tcPr>
-            <w:tcW w:type="dxa" w:w="5272"/>
-            <w:tcW w:w="5273" w:type="dxa"/>
-            <w:tcW w:w="5273" w:type="dxa"/>
-          </w:tcPr>
-          <w:p>
-            <w:pPr>
-              <w:jc w:val="both"/>
+            <w:tcW w:type="dxa" w:w="4649"/>
+            <w:tcMar>
+              <w:top w:w="80" w:type="dxa"/>
+              <w:bottom w:w="80" w:type="dxa"/>
+              <w:left w:w="100" w:type="dxa"/>
+              <w:right w:w="100" w:type="dxa"/>
+            </w:tcMar>
+          </w:tcPr>
+          <w:p>
+            <w:pPr>
+              <w:spacing w:before="40" w:after="40" w:line="276" w:lineRule="auto"/>
+              <w:jc w:val="left"/>
             </w:pPr>
             <w:r>
               <w:rPr>
@@ -4690,14 +4830,22 @@
         </w:tc>
       </w:tr>
       <w:tr>
-        <w:tc>
-          <w:tcPr>
-            <w:tcW w:type="dxa" w:w="510"/>
-            <w:tcW w:w="510" w:type="dxa"/>
-            <w:tcW w:w="510" w:type="dxa"/>
-          </w:tcPr>
-          <w:p>
-            <w:pPr>
+        <w:trPr>
+          <w:cantSplit/>
+        </w:trPr>
+        <w:tc>
+          <w:tcPr>
+            <w:tcW w:type="dxa" w:w="624"/>
+            <w:tcMar>
+              <w:top w:w="80" w:type="dxa"/>
+              <w:bottom w:w="80" w:type="dxa"/>
+              <w:left w:w="100" w:type="dxa"/>
+              <w:right w:w="100" w:type="dxa"/>
+            </w:tcMar>
+          </w:tcPr>
+          <w:p>
+            <w:pPr>
+              <w:spacing w:before="40" w:after="40" w:line="276" w:lineRule="auto"/>
               <w:jc w:val="center"/>
             </w:pPr>
             <w:r>
@@ -4711,13 +4859,18 @@
         </w:tc>
         <w:tc>
           <w:tcPr>
-            <w:tcW w:type="dxa" w:w="2154"/>
-            <w:tcW w:w="2154" w:type="dxa"/>
-            <w:tcW w:w="2154" w:type="dxa"/>
-          </w:tcPr>
-          <w:p>
-            <w:pPr>
-              <w:jc w:val="both"/>
+            <w:tcW w:type="dxa" w:w="3175"/>
+            <w:tcMar>
+              <w:top w:w="80" w:type="dxa"/>
+              <w:bottom w:w="80" w:type="dxa"/>
+              <w:left w:w="100" w:type="dxa"/>
+              <w:right w:w="100" w:type="dxa"/>
+            </w:tcMar>
+          </w:tcPr>
+          <w:p>
+            <w:pPr>
+              <w:spacing w:before="40" w:after="40" w:line="276" w:lineRule="auto"/>
+              <w:jc w:val="left"/>
             </w:pPr>
             <w:r>
               <w:rPr>
@@ -4730,12 +4883,17 @@
         </w:tc>
         <w:tc>
           <w:tcPr>
-            <w:tcW w:type="dxa" w:w="624"/>
-            <w:tcW w:w="623" w:type="dxa"/>
-            <w:tcW w:w="623" w:type="dxa"/>
-          </w:tcPr>
-          <w:p>
-            <w:pPr>
+            <w:tcW w:type="dxa" w:w="907"/>
+            <w:tcMar>
+              <w:top w:w="80" w:type="dxa"/>
+              <w:bottom w:w="80" w:type="dxa"/>
+              <w:left w:w="100" w:type="dxa"/>
+              <w:right w:w="100" w:type="dxa"/>
+            </w:tcMar>
+          </w:tcPr>
+          <w:p>
+            <w:pPr>
+              <w:spacing w:before="40" w:after="40" w:line="276" w:lineRule="auto"/>
               <w:jc w:val="center"/>
             </w:pPr>
             <w:r>
@@ -4749,32 +4907,18 @@
         </w:tc>
         <w:tc>
           <w:tcPr>
-            <w:tcW w:type="dxa" w:w="794"/>
-            <w:tcW w:w="793" w:type="dxa"/>
-            <w:tcW w:w="793" w:type="dxa"/>
-          </w:tcPr>
-          <w:p>
-            <w:pPr>
-              <w:jc w:val="center"/>
-            </w:pPr>
-            <w:r>
-              <w:rPr>
-                <w:rFonts w:ascii="Times New Roman" w:hAnsi="Times New Roman"/>
-                <w:sz w:val="26"/>
-              </w:rPr>
-              <w:t>34</w:t>
-            </w:r>
-          </w:p>
-        </w:tc>
-        <w:tc>
-          <w:tcPr>
-            <w:tcW w:type="dxa" w:w="5272"/>
-            <w:tcW w:w="5273" w:type="dxa"/>
-            <w:tcW w:w="5273" w:type="dxa"/>
-          </w:tcPr>
-          <w:p>
-            <w:pPr>
-              <w:jc w:val="both"/>
+            <w:tcW w:type="dxa" w:w="4649"/>
+            <w:tcMar>
+              <w:top w:w="80" w:type="dxa"/>
+              <w:bottom w:w="80" w:type="dxa"/>
+              <w:left w:w="100" w:type="dxa"/>
+              <w:right w:w="100" w:type="dxa"/>
+            </w:tcMar>
+          </w:tcPr>
+          <w:p>
+            <w:pPr>
+              <w:spacing w:before="40" w:after="40" w:line="276" w:lineRule="auto"/>
+              <w:jc w:val="left"/>
             </w:pPr>
             <w:r>
               <w:rPr>
@@ -4787,14 +4931,22 @@
         </w:tc>
       </w:tr>
       <w:tr>
-        <w:tc>
-          <w:tcPr>
-            <w:tcW w:type="dxa" w:w="510"/>
-            <w:tcW w:w="510" w:type="dxa"/>
-            <w:tcW w:w="510" w:type="dxa"/>
-          </w:tcPr>
-          <w:p>
-            <w:pPr>
+        <w:trPr>
+          <w:cantSplit/>
+        </w:trPr>
+        <w:tc>
+          <w:tcPr>
+            <w:tcW w:type="dxa" w:w="624"/>
+            <w:tcMar>
+              <w:top w:w="80" w:type="dxa"/>
+              <w:bottom w:w="80" w:type="dxa"/>
+              <w:left w:w="100" w:type="dxa"/>
+              <w:right w:w="100" w:type="dxa"/>
+            </w:tcMar>
+          </w:tcPr>
+          <w:p>
+            <w:pPr>
+              <w:spacing w:before="40" w:after="40" w:line="276" w:lineRule="auto"/>
               <w:jc w:val="center"/>
             </w:pPr>
             <w:r>
@@ -4808,17 +4960,23 @@
         </w:tc>
         <w:tc>
           <w:tcPr>
-            <w:tcW w:type="dxa" w:w="2154"/>
-            <w:tcW w:w="2154" w:type="dxa"/>
-            <w:tcW w:w="2154" w:type="dxa"/>
-          </w:tcPr>
-          <w:p>
-            <w:pPr>
-              <w:jc w:val="both"/>
-            </w:pPr>
-            <w:r>
-              <w:rPr>
-                <w:rFonts w:ascii="Times New Roman" w:hAnsi="Times New Roman"/>
+            <w:tcW w:type="dxa" w:w="3175"/>
+            <w:tcMar>
+              <w:top w:w="80" w:type="dxa"/>
+              <w:bottom w:w="80" w:type="dxa"/>
+              <w:left w:w="100" w:type="dxa"/>
+              <w:right w:w="100" w:type="dxa"/>
+            </w:tcMar>
+          </w:tcPr>
+          <w:p>
+            <w:pPr>
+              <w:spacing w:before="40" w:after="40" w:line="276" w:lineRule="auto"/>
+              <w:jc w:val="left"/>
+            </w:pPr>
+            <w:r>
+              <w:rPr>
+                <w:rFonts w:ascii="Times New Roman" w:hAnsi="Times New Roman"/>
+                <w:b/>
                 <w:sz w:val="26"/>
               </w:rPr>
               <w:t>ĐÁNH GIÁ ĐỊNH KỲ 4</w:t>
@@ -4827,12 +4985,17 @@
         </w:tc>
         <w:tc>
           <w:tcPr>
-            <w:tcW w:type="dxa" w:w="624"/>
-            <w:tcW w:w="623" w:type="dxa"/>
-            <w:tcW w:w="623" w:type="dxa"/>
-          </w:tcPr>
-          <w:p>
-            <w:pPr>
+            <w:tcW w:type="dxa" w:w="907"/>
+            <w:tcMar>
+              <w:top w:w="80" w:type="dxa"/>
+              <w:bottom w:w="80" w:type="dxa"/>
+              <w:left w:w="100" w:type="dxa"/>
+              <w:right w:w="100" w:type="dxa"/>
+            </w:tcMar>
+          </w:tcPr>
+          <w:p>
+            <w:pPr>
+              <w:spacing w:before="40" w:after="40" w:line="276" w:lineRule="auto"/>
               <w:jc w:val="center"/>
             </w:pPr>
             <w:r>
@@ -4846,32 +5009,18 @@
         </w:tc>
         <w:tc>
           <w:tcPr>
-            <w:tcW w:type="dxa" w:w="794"/>
-            <w:tcW w:w="793" w:type="dxa"/>
-            <w:tcW w:w="793" w:type="dxa"/>
-          </w:tcPr>
-          <w:p>
-            <w:pPr>
-              <w:jc w:val="center"/>
-            </w:pPr>
-            <w:r>
-              <w:rPr>
-                <w:rFonts w:ascii="Times New Roman" w:hAnsi="Times New Roman"/>
-                <w:sz w:val="26"/>
-              </w:rPr>
-              <w:t>35</w:t>
-            </w:r>
-          </w:p>
-        </w:tc>
-        <w:tc>
-          <w:tcPr>
-            <w:tcW w:type="dxa" w:w="5272"/>
-            <w:tcW w:w="5273" w:type="dxa"/>
-            <w:tcW w:w="5273" w:type="dxa"/>
-          </w:tcPr>
-          <w:p>
-            <w:pPr>
-              <w:jc w:val="both"/>
+            <w:tcW w:type="dxa" w:w="4649"/>
+            <w:tcMar>
+              <w:top w:w="80" w:type="dxa"/>
+              <w:bottom w:w="80" w:type="dxa"/>
+              <w:left w:w="100" w:type="dxa"/>
+              <w:right w:w="100" w:type="dxa"/>
+            </w:tcMar>
+          </w:tcPr>
+          <w:p>
+            <w:pPr>
+              <w:spacing w:before="40" w:after="40" w:line="276" w:lineRule="auto"/>
+              <w:jc w:val="left"/>
             </w:pPr>
             <w:r>
               <w:rPr>
@@ -4884,14 +5033,22 @@
         </w:tc>
       </w:tr>
       <w:tr>
-        <w:tc>
-          <w:tcPr>
-            <w:tcW w:type="dxa" w:w="510"/>
-            <w:tcW w:w="510" w:type="dxa"/>
-            <w:tcW w:w="510" w:type="dxa"/>
-          </w:tcPr>
-          <w:p>
-            <w:pPr>
+        <w:trPr>
+          <w:cantSplit/>
+        </w:trPr>
+        <w:tc>
+          <w:tcPr>
+            <w:tcW w:type="dxa" w:w="624"/>
+            <w:tcMar>
+              <w:top w:w="80" w:type="dxa"/>
+              <w:bottom w:w="80" w:type="dxa"/>
+              <w:left w:w="100" w:type="dxa"/>
+              <w:right w:w="100" w:type="dxa"/>
+            </w:tcMar>
+          </w:tcPr>
+          <w:p>
+            <w:pPr>
+              <w:spacing w:before="40" w:after="40" w:line="276" w:lineRule="auto"/>
               <w:jc w:val="center"/>
             </w:pPr>
             <w:r>
@@ -4905,13 +5062,18 @@
         </w:tc>
         <w:tc>
           <w:tcPr>
-            <w:tcW w:type="dxa" w:w="2154"/>
-            <w:tcW w:w="2154" w:type="dxa"/>
-            <w:tcW w:w="2154" w:type="dxa"/>
-          </w:tcPr>
-          <w:p>
-            <w:pPr>
-              <w:jc w:val="both"/>
+            <w:tcW w:type="dxa" w:w="3175"/>
+            <w:tcMar>
+              <w:top w:w="80" w:type="dxa"/>
+              <w:bottom w:w="80" w:type="dxa"/>
+              <w:left w:w="100" w:type="dxa"/>
+              <w:right w:w="100" w:type="dxa"/>
+            </w:tcMar>
+          </w:tcPr>
+          <w:p>
+            <w:pPr>
+              <w:spacing w:before="40" w:after="40" w:line="276" w:lineRule="auto"/>
+              <w:jc w:val="left"/>
             </w:pPr>
             <w:r>
               <w:rPr>
@@ -4924,12 +5086,17 @@
         </w:tc>
         <w:tc>
           <w:tcPr>
-            <w:tcW w:type="dxa" w:w="624"/>
-            <w:tcW w:w="623" w:type="dxa"/>
-            <w:tcW w:w="623" w:type="dxa"/>
-          </w:tcPr>
-          <w:p>
-            <w:pPr>
+            <w:tcW w:type="dxa" w:w="907"/>
+            <w:tcMar>
+              <w:top w:w="80" w:type="dxa"/>
+              <w:bottom w:w="80" w:type="dxa"/>
+              <w:left w:w="100" w:type="dxa"/>
+              <w:right w:w="100" w:type="dxa"/>
+            </w:tcMar>
+          </w:tcPr>
+          <w:p>
+            <w:pPr>
+              <w:spacing w:before="40" w:after="40" w:line="276" w:lineRule="auto"/>
               <w:jc w:val="center"/>
             </w:pPr>
             <w:r>
@@ -4943,32 +5110,18 @@
         </w:tc>
         <w:tc>
           <w:tcPr>
-            <w:tcW w:type="dxa" w:w="794"/>
-            <w:tcW w:w="793" w:type="dxa"/>
-            <w:tcW w:w="793" w:type="dxa"/>
-          </w:tcPr>
-          <w:p>
-            <w:pPr>
-              <w:jc w:val="center"/>
-            </w:pPr>
-            <w:r>
-              <w:rPr>
-                <w:rFonts w:ascii="Times New Roman" w:hAnsi="Times New Roman"/>
-                <w:sz w:val="26"/>
-              </w:rPr>
-              <w:t>36</w:t>
-            </w:r>
-          </w:p>
-        </w:tc>
-        <w:tc>
-          <w:tcPr>
-            <w:tcW w:type="dxa" w:w="5272"/>
-            <w:tcW w:w="5273" w:type="dxa"/>
-            <w:tcW w:w="5273" w:type="dxa"/>
-          </w:tcPr>
-          <w:p>
-            <w:pPr>
-              <w:jc w:val="both"/>
+            <w:tcW w:type="dxa" w:w="4649"/>
+            <w:tcMar>
+              <w:top w:w="80" w:type="dxa"/>
+              <w:bottom w:w="80" w:type="dxa"/>
+              <w:left w:w="100" w:type="dxa"/>
+              <w:right w:w="100" w:type="dxa"/>
+            </w:tcMar>
+          </w:tcPr>
+          <w:p>
+            <w:pPr>
+              <w:spacing w:before="40" w:after="40" w:line="276" w:lineRule="auto"/>
+              <w:jc w:val="left"/>
             </w:pPr>
             <w:r>
               <w:rPr>

</xml_diff>